<commit_message>
update documentation for BP_Tehnik_HomeOS
</commit_message>
<xml_diff>
--- a/dokumentace/BP_Tehnik_HomeOS.docx
+++ b/dokumentace/BP_Tehnik_HomeOS.docx
@@ -11242,7 +11242,7 @@
                     </pic:cNvPicPr>
                   </pic:nvPicPr>
                   <pic:blipFill>
-                    <a:blip r:embed="rId7">
+                    <a:blip r:embed="rId8">
                       <a:extLst>
                         <a:ext uri="{28A0092B-C50C-407E-A947-70E740481C1C}">
                           <a14:useLocalDpi xmlns:a14="http://schemas.microsoft.com/office/drawing/2010/main" val="0"/>
@@ -11353,7 +11353,15 @@
         <w:jc w:val="both"/>
       </w:pPr>
       <w:r>
-        <w:t xml:space="preserve">Užiji-li bakalářskou práci nebo poskytnu-li licenci k jejímu využití, jsem si vědom/a povinnosti informovat o této skutečnosti Technickou univerzitu v Liberci; v tomto případě má Technická univerzita v Liberci právo ode mne požadovat úhradu nákladů, které vynaložila na vytvoření díla, až do jejich skutečné výše. </w:t>
+        <w:t xml:space="preserve">Užiji-li bakalářskou práci nebo poskytnu-li licenci k jejímu využití, jsem si vědom/a povinnosti informovat o této skutečnosti Technickou univerzitu v Liberci; v tomto případě má Technická univerzita v Liberci právo ode </w:t>
+      </w:r>
+      <w:proofErr w:type="gramStart"/>
+      <w:r>
+        <w:t>mne</w:t>
+      </w:r>
+      <w:proofErr w:type="gramEnd"/>
+      <w:r>
+        <w:t xml:space="preserve"> požadovat úhradu nákladů, které vynaložila na vytvoření díla, až do jejich skutečné výše. </w:t>
       </w:r>
     </w:p>
     <w:p>
@@ -11853,7 +11861,7 @@
           <w:rFonts w:ascii="Times New Roman" w:eastAsia="Times New Roman" w:hAnsi="Times New Roman" w:cs="Times New Roman"/>
           <w:sz w:val="24"/>
         </w:rPr>
-        <w:t xml:space="preserve"> </w:t>
+        <w:t xml:space="preserve"> of </w:t>
       </w:r>
       <w:proofErr w:type="spellStart"/>
       <w:r>
@@ -11861,7 +11869,7 @@
           <w:rFonts w:ascii="Times New Roman" w:eastAsia="Times New Roman" w:hAnsi="Times New Roman" w:cs="Times New Roman"/>
           <w:sz w:val="24"/>
         </w:rPr>
-        <w:t>of</w:t>
+        <w:t>this</w:t>
       </w:r>
       <w:proofErr w:type="spellEnd"/>
       <w:r>
@@ -11869,7 +11877,7 @@
           <w:rFonts w:ascii="Times New Roman" w:eastAsia="Times New Roman" w:hAnsi="Times New Roman" w:cs="Times New Roman"/>
           <w:sz w:val="24"/>
         </w:rPr>
-        <w:t xml:space="preserve"> </w:t>
+        <w:t xml:space="preserve"> thesis </w:t>
       </w:r>
       <w:proofErr w:type="spellStart"/>
       <w:r>
@@ -11877,7 +11885,7 @@
           <w:rFonts w:ascii="Times New Roman" w:eastAsia="Times New Roman" w:hAnsi="Times New Roman" w:cs="Times New Roman"/>
           <w:sz w:val="24"/>
         </w:rPr>
-        <w:t>this</w:t>
+        <w:t>is</w:t>
       </w:r>
       <w:proofErr w:type="spellEnd"/>
       <w:r>
@@ -11885,7 +11893,7 @@
           <w:rFonts w:ascii="Times New Roman" w:eastAsia="Times New Roman" w:hAnsi="Times New Roman" w:cs="Times New Roman"/>
           <w:sz w:val="24"/>
         </w:rPr>
-        <w:t xml:space="preserve"> thesis </w:t>
+        <w:t xml:space="preserve"> to </w:t>
       </w:r>
       <w:proofErr w:type="spellStart"/>
       <w:r>
@@ -11893,7 +11901,7 @@
           <w:rFonts w:ascii="Times New Roman" w:eastAsia="Times New Roman" w:hAnsi="Times New Roman" w:cs="Times New Roman"/>
           <w:sz w:val="24"/>
         </w:rPr>
-        <w:t>is</w:t>
+        <w:t>create</w:t>
       </w:r>
       <w:proofErr w:type="spellEnd"/>
       <w:r>
@@ -11901,7 +11909,7 @@
           <w:rFonts w:ascii="Times New Roman" w:eastAsia="Times New Roman" w:hAnsi="Times New Roman" w:cs="Times New Roman"/>
           <w:sz w:val="24"/>
         </w:rPr>
-        <w:t xml:space="preserve"> to </w:t>
+        <w:t xml:space="preserve"> a web </w:t>
       </w:r>
       <w:proofErr w:type="spellStart"/>
       <w:r>
@@ -11909,7 +11917,7 @@
           <w:rFonts w:ascii="Times New Roman" w:eastAsia="Times New Roman" w:hAnsi="Times New Roman" w:cs="Times New Roman"/>
           <w:sz w:val="24"/>
         </w:rPr>
-        <w:t>create</w:t>
+        <w:t>application</w:t>
       </w:r>
       <w:proofErr w:type="spellEnd"/>
       <w:r>
@@ -11917,7 +11925,7 @@
           <w:rFonts w:ascii="Times New Roman" w:eastAsia="Times New Roman" w:hAnsi="Times New Roman" w:cs="Times New Roman"/>
           <w:sz w:val="24"/>
         </w:rPr>
-        <w:t xml:space="preserve"> a web </w:t>
+        <w:t xml:space="preserve"> </w:t>
       </w:r>
       <w:proofErr w:type="spellStart"/>
       <w:r>
@@ -11925,7 +11933,7 @@
           <w:rFonts w:ascii="Times New Roman" w:eastAsia="Times New Roman" w:hAnsi="Times New Roman" w:cs="Times New Roman"/>
           <w:sz w:val="24"/>
         </w:rPr>
-        <w:t>application</w:t>
+        <w:t>for</w:t>
       </w:r>
       <w:proofErr w:type="spellEnd"/>
       <w:r>
@@ -11941,7 +11949,7 @@
           <w:rFonts w:ascii="Times New Roman" w:eastAsia="Times New Roman" w:hAnsi="Times New Roman" w:cs="Times New Roman"/>
           <w:sz w:val="24"/>
         </w:rPr>
-        <w:t>for</w:t>
+        <w:t>smart</w:t>
       </w:r>
       <w:proofErr w:type="spellEnd"/>
       <w:r>
@@ -11957,7 +11965,7 @@
           <w:rFonts w:ascii="Times New Roman" w:eastAsia="Times New Roman" w:hAnsi="Times New Roman" w:cs="Times New Roman"/>
           <w:sz w:val="24"/>
         </w:rPr>
-        <w:t>smart</w:t>
+        <w:t>home</w:t>
       </w:r>
       <w:proofErr w:type="spellEnd"/>
       <w:r>
@@ -11965,7 +11973,7 @@
           <w:rFonts w:ascii="Times New Roman" w:eastAsia="Times New Roman" w:hAnsi="Times New Roman" w:cs="Times New Roman"/>
           <w:sz w:val="24"/>
         </w:rPr>
-        <w:t xml:space="preserve"> </w:t>
+        <w:t xml:space="preserve"> management </w:t>
       </w:r>
       <w:proofErr w:type="spellStart"/>
       <w:r>
@@ -11973,7 +11981,7 @@
           <w:rFonts w:ascii="Times New Roman" w:eastAsia="Times New Roman" w:hAnsi="Times New Roman" w:cs="Times New Roman"/>
           <w:sz w:val="24"/>
         </w:rPr>
-        <w:t>home</w:t>
+        <w:t>that</w:t>
       </w:r>
       <w:proofErr w:type="spellEnd"/>
       <w:r>
@@ -11981,7 +11989,7 @@
           <w:rFonts w:ascii="Times New Roman" w:eastAsia="Times New Roman" w:hAnsi="Times New Roman" w:cs="Times New Roman"/>
           <w:sz w:val="24"/>
         </w:rPr>
-        <w:t xml:space="preserve"> management </w:t>
+        <w:t xml:space="preserve"> </w:t>
       </w:r>
       <w:proofErr w:type="spellStart"/>
       <w:r>
@@ -11989,7 +11997,7 @@
           <w:rFonts w:ascii="Times New Roman" w:eastAsia="Times New Roman" w:hAnsi="Times New Roman" w:cs="Times New Roman"/>
           <w:sz w:val="24"/>
         </w:rPr>
-        <w:t>that</w:t>
+        <w:t>will</w:t>
       </w:r>
       <w:proofErr w:type="spellEnd"/>
       <w:r>
@@ -11997,7 +12005,7 @@
           <w:rFonts w:ascii="Times New Roman" w:eastAsia="Times New Roman" w:hAnsi="Times New Roman" w:cs="Times New Roman"/>
           <w:sz w:val="24"/>
         </w:rPr>
-        <w:t xml:space="preserve"> </w:t>
+        <w:t xml:space="preserve"> run on a single-</w:t>
       </w:r>
       <w:proofErr w:type="spellStart"/>
       <w:r>
@@ -12005,7 +12013,7 @@
           <w:rFonts w:ascii="Times New Roman" w:eastAsia="Times New Roman" w:hAnsi="Times New Roman" w:cs="Times New Roman"/>
           <w:sz w:val="24"/>
         </w:rPr>
-        <w:t>will</w:t>
+        <w:t>board</w:t>
       </w:r>
       <w:proofErr w:type="spellEnd"/>
       <w:r>
@@ -12013,7 +12021,7 @@
           <w:rFonts w:ascii="Times New Roman" w:eastAsia="Times New Roman" w:hAnsi="Times New Roman" w:cs="Times New Roman"/>
           <w:sz w:val="24"/>
         </w:rPr>
-        <w:t xml:space="preserve"> run on a single-</w:t>
+        <w:t xml:space="preserve"> </w:t>
       </w:r>
       <w:proofErr w:type="spellStart"/>
       <w:r>
@@ -12021,7 +12029,7 @@
           <w:rFonts w:ascii="Times New Roman" w:eastAsia="Times New Roman" w:hAnsi="Times New Roman" w:cs="Times New Roman"/>
           <w:sz w:val="24"/>
         </w:rPr>
-        <w:t>board</w:t>
+        <w:t>computer</w:t>
       </w:r>
       <w:proofErr w:type="spellEnd"/>
       <w:r>
@@ -12037,7 +12045,7 @@
           <w:rFonts w:ascii="Times New Roman" w:eastAsia="Times New Roman" w:hAnsi="Times New Roman" w:cs="Times New Roman"/>
           <w:sz w:val="24"/>
         </w:rPr>
-        <w:t>computer</w:t>
+        <w:t>with</w:t>
       </w:r>
       <w:proofErr w:type="spellEnd"/>
       <w:r>
@@ -12045,7 +12053,7 @@
           <w:rFonts w:ascii="Times New Roman" w:eastAsia="Times New Roman" w:hAnsi="Times New Roman" w:cs="Times New Roman"/>
           <w:sz w:val="24"/>
         </w:rPr>
-        <w:t xml:space="preserve"> </w:t>
+        <w:t xml:space="preserve"> Linux. </w:t>
       </w:r>
       <w:proofErr w:type="spellStart"/>
       <w:r>
@@ -12053,7 +12061,7 @@
           <w:rFonts w:ascii="Times New Roman" w:eastAsia="Times New Roman" w:hAnsi="Times New Roman" w:cs="Times New Roman"/>
           <w:sz w:val="24"/>
         </w:rPr>
-        <w:t>with</w:t>
+        <w:t>The</w:t>
       </w:r>
       <w:proofErr w:type="spellEnd"/>
       <w:r>
@@ -12061,7 +12069,7 @@
           <w:rFonts w:ascii="Times New Roman" w:eastAsia="Times New Roman" w:hAnsi="Times New Roman" w:cs="Times New Roman"/>
           <w:sz w:val="24"/>
         </w:rPr>
-        <w:t xml:space="preserve"> Linux. </w:t>
+        <w:t xml:space="preserve"> </w:t>
       </w:r>
       <w:proofErr w:type="spellStart"/>
       <w:r>
@@ -12069,7 +12077,7 @@
           <w:rFonts w:ascii="Times New Roman" w:eastAsia="Times New Roman" w:hAnsi="Times New Roman" w:cs="Times New Roman"/>
           <w:sz w:val="24"/>
         </w:rPr>
-        <w:t>The</w:t>
+        <w:t>application</w:t>
       </w:r>
       <w:proofErr w:type="spellEnd"/>
       <w:r>
@@ -12085,7 +12093,7 @@
           <w:rFonts w:ascii="Times New Roman" w:eastAsia="Times New Roman" w:hAnsi="Times New Roman" w:cs="Times New Roman"/>
           <w:sz w:val="24"/>
         </w:rPr>
-        <w:t>application</w:t>
+        <w:t>will</w:t>
       </w:r>
       <w:proofErr w:type="spellEnd"/>
       <w:r>
@@ -12101,7 +12109,7 @@
           <w:rFonts w:ascii="Times New Roman" w:eastAsia="Times New Roman" w:hAnsi="Times New Roman" w:cs="Times New Roman"/>
           <w:sz w:val="24"/>
         </w:rPr>
-        <w:t>will</w:t>
+        <w:t>enable</w:t>
       </w:r>
       <w:proofErr w:type="spellEnd"/>
       <w:r>
@@ -12117,7 +12125,7 @@
           <w:rFonts w:ascii="Times New Roman" w:eastAsia="Times New Roman" w:hAnsi="Times New Roman" w:cs="Times New Roman"/>
           <w:sz w:val="24"/>
         </w:rPr>
-        <w:t>enable</w:t>
+        <w:t>the</w:t>
       </w:r>
       <w:proofErr w:type="spellEnd"/>
       <w:r>
@@ -12133,7 +12141,7 @@
           <w:rFonts w:ascii="Times New Roman" w:eastAsia="Times New Roman" w:hAnsi="Times New Roman" w:cs="Times New Roman"/>
           <w:sz w:val="24"/>
         </w:rPr>
-        <w:t>the</w:t>
+        <w:t>collection</w:t>
       </w:r>
       <w:proofErr w:type="spellEnd"/>
       <w:r>
@@ -12141,7 +12149,7 @@
           <w:rFonts w:ascii="Times New Roman" w:eastAsia="Times New Roman" w:hAnsi="Times New Roman" w:cs="Times New Roman"/>
           <w:sz w:val="24"/>
         </w:rPr>
-        <w:t xml:space="preserve"> </w:t>
+        <w:t xml:space="preserve"> and </w:t>
       </w:r>
       <w:proofErr w:type="spellStart"/>
       <w:r>
@@ -12149,7 +12157,7 @@
           <w:rFonts w:ascii="Times New Roman" w:eastAsia="Times New Roman" w:hAnsi="Times New Roman" w:cs="Times New Roman"/>
           <w:sz w:val="24"/>
         </w:rPr>
-        <w:t>collection</w:t>
+        <w:t>storage</w:t>
       </w:r>
       <w:proofErr w:type="spellEnd"/>
       <w:r>
@@ -12157,39 +12165,7 @@
           <w:rFonts w:ascii="Times New Roman" w:eastAsia="Times New Roman" w:hAnsi="Times New Roman" w:cs="Times New Roman"/>
           <w:sz w:val="24"/>
         </w:rPr>
-        <w:t xml:space="preserve"> and </w:t>
-      </w:r>
-      <w:proofErr w:type="spellStart"/>
-      <w:r>
-        <w:rPr>
-          <w:rFonts w:ascii="Times New Roman" w:eastAsia="Times New Roman" w:hAnsi="Times New Roman" w:cs="Times New Roman"/>
-          <w:sz w:val="24"/>
-        </w:rPr>
-        <w:t>storage</w:t>
-      </w:r>
-      <w:proofErr w:type="spellEnd"/>
-      <w:r>
-        <w:rPr>
-          <w:rFonts w:ascii="Times New Roman" w:eastAsia="Times New Roman" w:hAnsi="Times New Roman" w:cs="Times New Roman"/>
-          <w:sz w:val="24"/>
-        </w:rPr>
-        <w:t xml:space="preserve"> </w:t>
-      </w:r>
-      <w:proofErr w:type="spellStart"/>
-      <w:r>
-        <w:rPr>
-          <w:rFonts w:ascii="Times New Roman" w:eastAsia="Times New Roman" w:hAnsi="Times New Roman" w:cs="Times New Roman"/>
-          <w:sz w:val="24"/>
-        </w:rPr>
-        <w:t>of</w:t>
-      </w:r>
-      <w:proofErr w:type="spellEnd"/>
-      <w:r>
-        <w:rPr>
-          <w:rFonts w:ascii="Times New Roman" w:eastAsia="Times New Roman" w:hAnsi="Times New Roman" w:cs="Times New Roman"/>
-          <w:sz w:val="24"/>
-        </w:rPr>
-        <w:t xml:space="preserve"> data </w:t>
+        <w:t xml:space="preserve"> of data </w:t>
       </w:r>
       <w:proofErr w:type="spellStart"/>
       <w:r>
@@ -13203,7 +13179,7 @@
           <w:r>
             <w:fldChar w:fldCharType="separate"/>
           </w:r>
-          <w:hyperlink w:anchor="_Toc213609420" w:history="1">
+          <w:hyperlink w:anchor="_Toc225844738" w:history="1">
             <w:r>
               <w:rPr>
                 <w:rStyle w:val="Hypertextovodkaz"/>
@@ -13230,7 +13206,7 @@
                 <w:noProof/>
                 <w:webHidden/>
               </w:rPr>
-              <w:instrText xml:space="preserve"> PAGEREF _Toc213609420 \h </w:instrText>
+              <w:instrText xml:space="preserve"> PAGEREF _Toc225844738 \h </w:instrText>
             </w:r>
             <w:r>
               <w:rPr>
@@ -13250,7 +13226,7 @@
                 <w:noProof/>
                 <w:webHidden/>
               </w:rPr>
-              <w:t>8</w:t>
+              <w:t>9</w:t>
             </w:r>
             <w:r>
               <w:rPr>
@@ -13273,7 +13249,7 @@
               <w:color w:val="auto"/>
             </w:rPr>
           </w:pPr>
-          <w:hyperlink w:anchor="_Toc213609421" w:history="1">
+          <w:hyperlink w:anchor="_Toc225844739" w:history="1">
             <w:r>
               <w:rPr>
                 <w:rStyle w:val="Hypertextovodkaz"/>
@@ -13315,7 +13291,7 @@
                 <w:noProof/>
                 <w:webHidden/>
               </w:rPr>
-              <w:instrText xml:space="preserve"> PAGEREF _Toc213609421 \h </w:instrText>
+              <w:instrText xml:space="preserve"> PAGEREF _Toc225844739 \h </w:instrText>
             </w:r>
             <w:r>
               <w:rPr>
@@ -13335,7 +13311,7 @@
                 <w:noProof/>
                 <w:webHidden/>
               </w:rPr>
-              <w:t>8</w:t>
+              <w:t>9</w:t>
             </w:r>
             <w:r>
               <w:rPr>
@@ -13358,7 +13334,7 @@
               <w:color w:val="auto"/>
             </w:rPr>
           </w:pPr>
-          <w:hyperlink w:anchor="_Toc213609422" w:history="1">
+          <w:hyperlink w:anchor="_Toc225844740" w:history="1">
             <w:r>
               <w:rPr>
                 <w:rStyle w:val="Hypertextovodkaz"/>
@@ -13386,7 +13362,7 @@
                 <w:noProof/>
                 <w:webHidden/>
               </w:rPr>
-              <w:instrText xml:space="preserve"> PAGEREF _Toc213609422 \h </w:instrText>
+              <w:instrText xml:space="preserve"> PAGEREF _Toc225844740 \h </w:instrText>
             </w:r>
             <w:r>
               <w:rPr>
@@ -13406,7 +13382,7 @@
                 <w:noProof/>
                 <w:webHidden/>
               </w:rPr>
-              <w:t>8</w:t>
+              <w:t>9</w:t>
             </w:r>
             <w:r>
               <w:rPr>
@@ -13429,7 +13405,7 @@
               <w:color w:val="auto"/>
             </w:rPr>
           </w:pPr>
-          <w:hyperlink w:anchor="_Toc213609423" w:history="1">
+          <w:hyperlink w:anchor="_Toc225844741" w:history="1">
             <w:r>
               <w:rPr>
                 <w:rStyle w:val="Hypertextovodkaz"/>
@@ -13457,7 +13433,7 @@
                 <w:noProof/>
                 <w:webHidden/>
               </w:rPr>
-              <w:instrText xml:space="preserve"> PAGEREF _Toc213609423 \h </w:instrText>
+              <w:instrText xml:space="preserve"> PAGEREF _Toc225844741 \h </w:instrText>
             </w:r>
             <w:r>
               <w:rPr>
@@ -13477,7 +13453,357 @@
                 <w:noProof/>
                 <w:webHidden/>
               </w:rPr>
-              <w:t>8</w:t>
+              <w:t>10</w:t>
+            </w:r>
+            <w:r>
+              <w:rPr>
+                <w:noProof/>
+                <w:webHidden/>
+              </w:rPr>
+              <w:fldChar w:fldCharType="end"/>
+            </w:r>
+          </w:hyperlink>
+        </w:p>
+        <w:p>
+          <w:pPr>
+            <w:pStyle w:val="Obsah2"/>
+            <w:tabs>
+              <w:tab w:val="right" w:leader="dot" w:pos="9061"/>
+            </w:tabs>
+            <w:rPr>
+              <w:rFonts w:asciiTheme="minorHAnsi" w:eastAsiaTheme="minorEastAsia" w:hAnsiTheme="minorHAnsi" w:cstheme="minorBidi"/>
+              <w:noProof/>
+              <w:color w:val="auto"/>
+            </w:rPr>
+          </w:pPr>
+          <w:hyperlink w:anchor="_Toc225844742" w:history="1">
+            <w:r>
+              <w:rPr>
+                <w:rStyle w:val="Hypertextovodkaz"/>
+                <w:noProof/>
+              </w:rPr>
+              <w:t>1.4 Flask</w:t>
+            </w:r>
+            <w:r>
+              <w:rPr>
+                <w:noProof/>
+                <w:webHidden/>
+              </w:rPr>
+              <w:tab/>
+            </w:r>
+            <w:r>
+              <w:rPr>
+                <w:noProof/>
+                <w:webHidden/>
+              </w:rPr>
+              <w:fldChar w:fldCharType="begin"/>
+            </w:r>
+            <w:r>
+              <w:rPr>
+                <w:noProof/>
+                <w:webHidden/>
+              </w:rPr>
+              <w:instrText xml:space="preserve"> PAGEREF _Toc225844742 \h </w:instrText>
+            </w:r>
+            <w:r>
+              <w:rPr>
+                <w:noProof/>
+                <w:webHidden/>
+              </w:rPr>
+            </w:r>
+            <w:r>
+              <w:rPr>
+                <w:noProof/>
+                <w:webHidden/>
+              </w:rPr>
+              <w:fldChar w:fldCharType="separate"/>
+            </w:r>
+            <w:r>
+              <w:rPr>
+                <w:noProof/>
+                <w:webHidden/>
+              </w:rPr>
+              <w:t>10</w:t>
+            </w:r>
+            <w:r>
+              <w:rPr>
+                <w:noProof/>
+                <w:webHidden/>
+              </w:rPr>
+              <w:fldChar w:fldCharType="end"/>
+            </w:r>
+          </w:hyperlink>
+        </w:p>
+        <w:p>
+          <w:pPr>
+            <w:pStyle w:val="Obsah2"/>
+            <w:tabs>
+              <w:tab w:val="right" w:leader="dot" w:pos="9061"/>
+            </w:tabs>
+            <w:rPr>
+              <w:rFonts w:asciiTheme="minorHAnsi" w:eastAsiaTheme="minorEastAsia" w:hAnsiTheme="minorHAnsi" w:cstheme="minorBidi"/>
+              <w:noProof/>
+              <w:color w:val="auto"/>
+            </w:rPr>
+          </w:pPr>
+          <w:hyperlink w:anchor="_Toc225844743" w:history="1">
+            <w:r>
+              <w:rPr>
+                <w:rStyle w:val="Hypertextovodkaz"/>
+                <w:noProof/>
+              </w:rPr>
+              <w:t>1.5 HTTP protokol</w:t>
+            </w:r>
+            <w:r>
+              <w:rPr>
+                <w:noProof/>
+                <w:webHidden/>
+              </w:rPr>
+              <w:tab/>
+            </w:r>
+            <w:r>
+              <w:rPr>
+                <w:noProof/>
+                <w:webHidden/>
+              </w:rPr>
+              <w:fldChar w:fldCharType="begin"/>
+            </w:r>
+            <w:r>
+              <w:rPr>
+                <w:noProof/>
+                <w:webHidden/>
+              </w:rPr>
+              <w:instrText xml:space="preserve"> PAGEREF _Toc225844743 \h </w:instrText>
+            </w:r>
+            <w:r>
+              <w:rPr>
+                <w:noProof/>
+                <w:webHidden/>
+              </w:rPr>
+            </w:r>
+            <w:r>
+              <w:rPr>
+                <w:noProof/>
+                <w:webHidden/>
+              </w:rPr>
+              <w:fldChar w:fldCharType="separate"/>
+            </w:r>
+            <w:r>
+              <w:rPr>
+                <w:noProof/>
+                <w:webHidden/>
+              </w:rPr>
+              <w:t>11</w:t>
+            </w:r>
+            <w:r>
+              <w:rPr>
+                <w:noProof/>
+                <w:webHidden/>
+              </w:rPr>
+              <w:fldChar w:fldCharType="end"/>
+            </w:r>
+          </w:hyperlink>
+        </w:p>
+        <w:p>
+          <w:pPr>
+            <w:pStyle w:val="Obsah2"/>
+            <w:tabs>
+              <w:tab w:val="right" w:leader="dot" w:pos="9061"/>
+            </w:tabs>
+            <w:rPr>
+              <w:rFonts w:asciiTheme="minorHAnsi" w:eastAsiaTheme="minorEastAsia" w:hAnsiTheme="minorHAnsi" w:cstheme="minorBidi"/>
+              <w:noProof/>
+              <w:color w:val="auto"/>
+            </w:rPr>
+          </w:pPr>
+          <w:hyperlink w:anchor="_Toc225844744" w:history="1">
+            <w:r>
+              <w:rPr>
+                <w:rStyle w:val="Hypertextovodkaz"/>
+                <w:noProof/>
+              </w:rPr>
+              <w:t>1.6 ESP32</w:t>
+            </w:r>
+            <w:r>
+              <w:rPr>
+                <w:noProof/>
+                <w:webHidden/>
+              </w:rPr>
+              <w:tab/>
+            </w:r>
+            <w:r>
+              <w:rPr>
+                <w:noProof/>
+                <w:webHidden/>
+              </w:rPr>
+              <w:fldChar w:fldCharType="begin"/>
+            </w:r>
+            <w:r>
+              <w:rPr>
+                <w:noProof/>
+                <w:webHidden/>
+              </w:rPr>
+              <w:instrText xml:space="preserve"> PAGEREF _Toc225844744 \h </w:instrText>
+            </w:r>
+            <w:r>
+              <w:rPr>
+                <w:noProof/>
+                <w:webHidden/>
+              </w:rPr>
+            </w:r>
+            <w:r>
+              <w:rPr>
+                <w:noProof/>
+                <w:webHidden/>
+              </w:rPr>
+              <w:fldChar w:fldCharType="separate"/>
+            </w:r>
+            <w:r>
+              <w:rPr>
+                <w:noProof/>
+                <w:webHidden/>
+              </w:rPr>
+              <w:t>12</w:t>
+            </w:r>
+            <w:r>
+              <w:rPr>
+                <w:noProof/>
+                <w:webHidden/>
+              </w:rPr>
+              <w:fldChar w:fldCharType="end"/>
+            </w:r>
+          </w:hyperlink>
+        </w:p>
+        <w:p>
+          <w:pPr>
+            <w:pStyle w:val="Obsah2"/>
+            <w:tabs>
+              <w:tab w:val="right" w:leader="dot" w:pos="9061"/>
+            </w:tabs>
+            <w:rPr>
+              <w:rFonts w:asciiTheme="minorHAnsi" w:eastAsiaTheme="minorEastAsia" w:hAnsiTheme="minorHAnsi" w:cstheme="minorBidi"/>
+              <w:noProof/>
+              <w:color w:val="auto"/>
+            </w:rPr>
+          </w:pPr>
+          <w:hyperlink w:anchor="_Toc225844745" w:history="1">
+            <w:r>
+              <w:rPr>
+                <w:rStyle w:val="Hypertextovodkaz"/>
+                <w:noProof/>
+              </w:rPr>
+              <w:t>1.6 M5stack</w:t>
+            </w:r>
+            <w:r>
+              <w:rPr>
+                <w:noProof/>
+                <w:webHidden/>
+              </w:rPr>
+              <w:tab/>
+            </w:r>
+            <w:r>
+              <w:rPr>
+                <w:noProof/>
+                <w:webHidden/>
+              </w:rPr>
+              <w:fldChar w:fldCharType="begin"/>
+            </w:r>
+            <w:r>
+              <w:rPr>
+                <w:noProof/>
+                <w:webHidden/>
+              </w:rPr>
+              <w:instrText xml:space="preserve"> PAGEREF _Toc225844745 \h </w:instrText>
+            </w:r>
+            <w:r>
+              <w:rPr>
+                <w:noProof/>
+                <w:webHidden/>
+              </w:rPr>
+            </w:r>
+            <w:r>
+              <w:rPr>
+                <w:noProof/>
+                <w:webHidden/>
+              </w:rPr>
+              <w:fldChar w:fldCharType="separate"/>
+            </w:r>
+            <w:r>
+              <w:rPr>
+                <w:noProof/>
+                <w:webHidden/>
+              </w:rPr>
+              <w:t>12</w:t>
+            </w:r>
+            <w:r>
+              <w:rPr>
+                <w:noProof/>
+                <w:webHidden/>
+              </w:rPr>
+              <w:fldChar w:fldCharType="end"/>
+            </w:r>
+          </w:hyperlink>
+        </w:p>
+        <w:p>
+          <w:pPr>
+            <w:pStyle w:val="Obsah2"/>
+            <w:tabs>
+              <w:tab w:val="right" w:leader="dot" w:pos="9061"/>
+            </w:tabs>
+            <w:rPr>
+              <w:rFonts w:asciiTheme="minorHAnsi" w:eastAsiaTheme="minorEastAsia" w:hAnsiTheme="minorHAnsi" w:cstheme="minorBidi"/>
+              <w:noProof/>
+              <w:color w:val="auto"/>
+            </w:rPr>
+          </w:pPr>
+          <w:hyperlink w:anchor="_Toc225844746" w:history="1">
+            <w:r>
+              <w:rPr>
+                <w:rStyle w:val="Hypertextovodkaz"/>
+                <w:noProof/>
+              </w:rPr>
+              <w:t>1.x Smart Home</w:t>
+            </w:r>
+            <w:r>
+              <w:rPr>
+                <w:noProof/>
+                <w:webHidden/>
+              </w:rPr>
+              <w:tab/>
+            </w:r>
+            <w:r>
+              <w:rPr>
+                <w:noProof/>
+                <w:webHidden/>
+              </w:rPr>
+              <w:fldChar w:fldCharType="begin"/>
+            </w:r>
+            <w:r>
+              <w:rPr>
+                <w:noProof/>
+                <w:webHidden/>
+              </w:rPr>
+              <w:instrText xml:space="preserve"> PAGEREF _Toc225844746 \h </w:instrText>
+            </w:r>
+            <w:r>
+              <w:rPr>
+                <w:noProof/>
+                <w:webHidden/>
+              </w:rPr>
+            </w:r>
+            <w:r>
+              <w:rPr>
+                <w:noProof/>
+                <w:webHidden/>
+              </w:rPr>
+              <w:fldChar w:fldCharType="separate"/>
+            </w:r>
+            <w:r>
+              <w:rPr>
+                <w:noProof/>
+                <w:webHidden/>
+              </w:rPr>
+              <w:t>12</w:t>
             </w:r>
             <w:r>
               <w:rPr>
@@ -13500,7 +13826,7 @@
               <w:color w:val="auto"/>
             </w:rPr>
           </w:pPr>
-          <w:hyperlink w:anchor="_Toc213609424" w:history="1">
+          <w:hyperlink w:anchor="_Toc225844747" w:history="1">
             <w:r>
               <w:rPr>
                 <w:rStyle w:val="Hypertextovodkaz"/>
@@ -13542,7 +13868,7 @@
                 <w:noProof/>
                 <w:webHidden/>
               </w:rPr>
-              <w:instrText xml:space="preserve"> PAGEREF _Toc213609424 \h </w:instrText>
+              <w:instrText xml:space="preserve"> PAGEREF _Toc225844747 \h </w:instrText>
             </w:r>
             <w:r>
               <w:rPr>
@@ -13562,7 +13888,7 @@
                 <w:noProof/>
                 <w:webHidden/>
               </w:rPr>
-              <w:t>9</w:t>
+              <w:t>13</w:t>
             </w:r>
             <w:r>
               <w:rPr>
@@ -13585,7 +13911,7 @@
               <w:color w:val="auto"/>
             </w:rPr>
           </w:pPr>
-          <w:hyperlink w:anchor="_Toc213609425" w:history="1">
+          <w:hyperlink w:anchor="_Toc225844748" w:history="1">
             <w:r>
               <w:rPr>
                 <w:rStyle w:val="Hypertextovodkaz"/>
@@ -13627,7 +13953,7 @@
                 <w:noProof/>
                 <w:webHidden/>
               </w:rPr>
-              <w:instrText xml:space="preserve"> PAGEREF _Toc213609425 \h </w:instrText>
+              <w:instrText xml:space="preserve"> PAGEREF _Toc225844748 \h </w:instrText>
             </w:r>
             <w:r>
               <w:rPr>
@@ -13647,7 +13973,7 @@
                 <w:noProof/>
                 <w:webHidden/>
               </w:rPr>
-              <w:t>9</w:t>
+              <w:t>13</w:t>
             </w:r>
             <w:r>
               <w:rPr>
@@ -13670,7 +13996,7 @@
               <w:color w:val="auto"/>
             </w:rPr>
           </w:pPr>
-          <w:hyperlink w:anchor="_Toc213609426" w:history="1">
+          <w:hyperlink w:anchor="_Toc225844749" w:history="1">
             <w:r>
               <w:rPr>
                 <w:rStyle w:val="Hypertextovodkaz"/>
@@ -13712,7 +14038,7 @@
                 <w:noProof/>
                 <w:webHidden/>
               </w:rPr>
-              <w:instrText xml:space="preserve"> PAGEREF _Toc213609426 \h </w:instrText>
+              <w:instrText xml:space="preserve"> PAGEREF _Toc225844749 \h </w:instrText>
             </w:r>
             <w:r>
               <w:rPr>
@@ -13732,7 +14058,7 @@
                 <w:noProof/>
                 <w:webHidden/>
               </w:rPr>
-              <w:t>9</w:t>
+              <w:t>13</w:t>
             </w:r>
             <w:r>
               <w:rPr>
@@ -13755,7 +14081,7 @@
               <w:color w:val="auto"/>
             </w:rPr>
           </w:pPr>
-          <w:hyperlink w:anchor="_Toc213609427" w:history="1">
+          <w:hyperlink w:anchor="_Toc225844750" w:history="1">
             <w:r>
               <w:rPr>
                 <w:rStyle w:val="Hypertextovodkaz"/>
@@ -13797,7 +14123,7 @@
                 <w:noProof/>
                 <w:webHidden/>
               </w:rPr>
-              <w:instrText xml:space="preserve"> PAGEREF _Toc213609427 \h </w:instrText>
+              <w:instrText xml:space="preserve"> PAGEREF _Toc225844750 \h </w:instrText>
             </w:r>
             <w:r>
               <w:rPr>
@@ -13817,7 +14143,7 @@
                 <w:noProof/>
                 <w:webHidden/>
               </w:rPr>
-              <w:t>9</w:t>
+              <w:t>14</w:t>
             </w:r>
             <w:r>
               <w:rPr>
@@ -13840,7 +14166,7 @@
               <w:color w:val="auto"/>
             </w:rPr>
           </w:pPr>
-          <w:hyperlink w:anchor="_Toc213609428" w:history="1">
+          <w:hyperlink w:anchor="_Toc225844751" w:history="1">
             <w:r>
               <w:rPr>
                 <w:rStyle w:val="Hypertextovodkaz"/>
@@ -13882,7 +14208,7 @@
                 <w:noProof/>
                 <w:webHidden/>
               </w:rPr>
-              <w:instrText xml:space="preserve"> PAGEREF _Toc213609428 \h </w:instrText>
+              <w:instrText xml:space="preserve"> PAGEREF _Toc225844751 \h </w:instrText>
             </w:r>
             <w:r>
               <w:rPr>
@@ -13902,7 +14228,7 @@
                 <w:noProof/>
                 <w:webHidden/>
               </w:rPr>
-              <w:t>10</w:t>
+              <w:t>14</w:t>
             </w:r>
             <w:r>
               <w:rPr>
@@ -13925,7 +14251,7 @@
               <w:color w:val="auto"/>
             </w:rPr>
           </w:pPr>
-          <w:hyperlink w:anchor="_Toc213609429" w:history="1">
+          <w:hyperlink w:anchor="_Toc225844752" w:history="1">
             <w:r>
               <w:rPr>
                 <w:rStyle w:val="Hypertextovodkaz"/>
@@ -13967,7 +14293,7 @@
                 <w:noProof/>
                 <w:webHidden/>
               </w:rPr>
-              <w:instrText xml:space="preserve"> PAGEREF _Toc213609429 \h </w:instrText>
+              <w:instrText xml:space="preserve"> PAGEREF _Toc225844752 \h </w:instrText>
             </w:r>
             <w:r>
               <w:rPr>
@@ -13987,7 +14313,7 @@
                 <w:noProof/>
                 <w:webHidden/>
               </w:rPr>
-              <w:t>10</w:t>
+              <w:t>14</w:t>
             </w:r>
             <w:r>
               <w:rPr>
@@ -14010,7 +14336,7 @@
               <w:color w:val="auto"/>
             </w:rPr>
           </w:pPr>
-          <w:hyperlink w:anchor="_Toc213609430" w:history="1">
+          <w:hyperlink w:anchor="_Toc225844753" w:history="1">
             <w:r>
               <w:rPr>
                 <w:rStyle w:val="Hypertextovodkaz"/>
@@ -14037,7 +14363,7 @@
                 <w:noProof/>
                 <w:webHidden/>
               </w:rPr>
-              <w:instrText xml:space="preserve"> PAGEREF _Toc213609430 \h </w:instrText>
+              <w:instrText xml:space="preserve"> PAGEREF _Toc225844753 \h </w:instrText>
             </w:r>
             <w:r>
               <w:rPr>
@@ -14057,7 +14383,7 @@
                 <w:noProof/>
                 <w:webHidden/>
               </w:rPr>
-              <w:t>10</w:t>
+              <w:t>14</w:t>
             </w:r>
             <w:r>
               <w:rPr>
@@ -14080,7 +14406,7 @@
               <w:color w:val="auto"/>
             </w:rPr>
           </w:pPr>
-          <w:hyperlink w:anchor="_Toc213609431" w:history="1">
+          <w:hyperlink w:anchor="_Toc225844754" w:history="1">
             <w:r>
               <w:rPr>
                 <w:rStyle w:val="Hypertextovodkaz"/>
@@ -14107,7 +14433,7 @@
                 <w:noProof/>
                 <w:webHidden/>
               </w:rPr>
-              <w:instrText xml:space="preserve"> PAGEREF _Toc213609431 \h </w:instrText>
+              <w:instrText xml:space="preserve"> PAGEREF _Toc225844754 \h </w:instrText>
             </w:r>
             <w:r>
               <w:rPr>
@@ -14127,7 +14453,7 @@
                 <w:noProof/>
                 <w:webHidden/>
               </w:rPr>
-              <w:t>10</w:t>
+              <w:t>14</w:t>
             </w:r>
             <w:r>
               <w:rPr>
@@ -14151,7 +14477,7 @@
               <w:color w:val="auto"/>
             </w:rPr>
           </w:pPr>
-          <w:hyperlink w:anchor="_Toc213609432" w:history="1">
+          <w:hyperlink w:anchor="_Toc225844755" w:history="1">
             <w:r>
               <w:rPr>
                 <w:rStyle w:val="Hypertextovodkaz"/>
@@ -14178,7 +14504,7 @@
                 <w:noProof/>
                 <w:webHidden/>
               </w:rPr>
-              <w:instrText xml:space="preserve"> PAGEREF _Toc213609432 \h </w:instrText>
+              <w:instrText xml:space="preserve"> PAGEREF _Toc225844755 \h </w:instrText>
             </w:r>
             <w:r>
               <w:rPr>
@@ -14198,7 +14524,7 @@
                 <w:noProof/>
                 <w:webHidden/>
               </w:rPr>
-              <w:t>10</w:t>
+              <w:t>14</w:t>
             </w:r>
             <w:r>
               <w:rPr>
@@ -14222,7 +14548,7 @@
               <w:color w:val="auto"/>
             </w:rPr>
           </w:pPr>
-          <w:hyperlink w:anchor="_Toc213609433" w:history="1">
+          <w:hyperlink w:anchor="_Toc225844756" w:history="1">
             <w:r>
               <w:rPr>
                 <w:rStyle w:val="Hypertextovodkaz"/>
@@ -14249,7 +14575,7 @@
                 <w:noProof/>
                 <w:webHidden/>
               </w:rPr>
-              <w:instrText xml:space="preserve"> PAGEREF _Toc213609433 \h </w:instrText>
+              <w:instrText xml:space="preserve"> PAGEREF _Toc225844756 \h </w:instrText>
             </w:r>
             <w:r>
               <w:rPr>
@@ -14269,7 +14595,7 @@
                 <w:noProof/>
                 <w:webHidden/>
               </w:rPr>
-              <w:t>11</w:t>
+              <w:t>15</w:t>
             </w:r>
             <w:r>
               <w:rPr>
@@ -14293,7 +14619,7 @@
               <w:color w:val="auto"/>
             </w:rPr>
           </w:pPr>
-          <w:hyperlink w:anchor="_Toc213609434" w:history="1">
+          <w:hyperlink w:anchor="_Toc225844757" w:history="1">
             <w:r>
               <w:rPr>
                 <w:rStyle w:val="Hypertextovodkaz"/>
@@ -14320,7 +14646,7 @@
                 <w:noProof/>
                 <w:webHidden/>
               </w:rPr>
-              <w:instrText xml:space="preserve"> PAGEREF _Toc213609434 \h </w:instrText>
+              <w:instrText xml:space="preserve"> PAGEREF _Toc225844757 \h </w:instrText>
             </w:r>
             <w:r>
               <w:rPr>
@@ -14340,7 +14666,7 @@
                 <w:noProof/>
                 <w:webHidden/>
               </w:rPr>
-              <w:t>12</w:t>
+              <w:t>16</w:t>
             </w:r>
             <w:r>
               <w:rPr>
@@ -14364,7 +14690,7 @@
               <w:color w:val="auto"/>
             </w:rPr>
           </w:pPr>
-          <w:hyperlink w:anchor="_Toc213609435" w:history="1">
+          <w:hyperlink w:anchor="_Toc225844758" w:history="1">
             <w:r>
               <w:rPr>
                 <w:rStyle w:val="Hypertextovodkaz"/>
@@ -14391,7 +14717,7 @@
                 <w:noProof/>
                 <w:webHidden/>
               </w:rPr>
-              <w:instrText xml:space="preserve"> PAGEREF _Toc213609435 \h </w:instrText>
+              <w:instrText xml:space="preserve"> PAGEREF _Toc225844758 \h </w:instrText>
             </w:r>
             <w:r>
               <w:rPr>
@@ -14411,7 +14737,7 @@
                 <w:noProof/>
                 <w:webHidden/>
               </w:rPr>
-              <w:t>13</w:t>
+              <w:t>17</w:t>
             </w:r>
             <w:r>
               <w:rPr>
@@ -14434,7 +14760,7 @@
               <w:color w:val="auto"/>
             </w:rPr>
           </w:pPr>
-          <w:hyperlink w:anchor="_Toc213609436" w:history="1">
+          <w:hyperlink w:anchor="_Toc225844759" w:history="1">
             <w:r>
               <w:rPr>
                 <w:rStyle w:val="Hypertextovodkaz"/>
@@ -14476,7 +14802,7 @@
                 <w:noProof/>
                 <w:webHidden/>
               </w:rPr>
-              <w:instrText xml:space="preserve"> PAGEREF _Toc213609436 \h </w:instrText>
+              <w:instrText xml:space="preserve"> PAGEREF _Toc225844759 \h </w:instrText>
             </w:r>
             <w:r>
               <w:rPr>
@@ -14496,7 +14822,7 @@
                 <w:noProof/>
                 <w:webHidden/>
               </w:rPr>
-              <w:t>13</w:t>
+              <w:t>17</w:t>
             </w:r>
             <w:r>
               <w:rPr>
@@ -14567,43 +14893,154 @@
     </w:p>
     <w:p>
       <w:pPr>
-        <w:spacing w:after="0"/>
-        <w:ind w:left="-5" w:hanging="10"/>
+        <w:pStyle w:val="Seznamobrzk"/>
+        <w:tabs>
+          <w:tab w:val="right" w:leader="dot" w:pos="9061"/>
+        </w:tabs>
+        <w:rPr>
+          <w:rFonts w:asciiTheme="minorHAnsi" w:eastAsiaTheme="minorEastAsia" w:hAnsiTheme="minorHAnsi" w:cstheme="minorBidi"/>
+          <w:noProof/>
+          <w:color w:val="auto"/>
+          <w:sz w:val="24"/>
+        </w:rPr>
       </w:pPr>
       <w:r>
-        <w:rPr>
-          <w:rFonts w:ascii="Times New Roman" w:eastAsia="Times New Roman" w:hAnsi="Times New Roman" w:cs="Times New Roman"/>
-          <w:sz w:val="24"/>
-        </w:rPr>
-        <w:t>Obrázek 1.1: Ukázka obrázku ..................................................................................................12</w:t>
-      </w:r>
-      <w:r>
-        <w:t xml:space="preserve"> </w:t>
-      </w:r>
+        <w:fldChar w:fldCharType="begin"/>
+      </w:r>
+      <w:r>
+        <w:instrText xml:space="preserve"> TOC \h \z \c "Obrázek" </w:instrText>
+      </w:r>
+      <w:r>
+        <w:fldChar w:fldCharType="separate"/>
+      </w:r>
+      <w:hyperlink w:anchor="_Toc225846415" w:history="1">
+        <w:r>
+          <w:rPr>
+            <w:rStyle w:val="Hypertextovodkaz"/>
+            <w:noProof/>
+          </w:rPr>
+          <w:t>Obrázek 1: Schéma webové stránky</w:t>
+        </w:r>
+        <w:r>
+          <w:rPr>
+            <w:noProof/>
+            <w:webHidden/>
+          </w:rPr>
+          <w:tab/>
+        </w:r>
+        <w:r>
+          <w:rPr>
+            <w:noProof/>
+            <w:webHidden/>
+          </w:rPr>
+          <w:fldChar w:fldCharType="begin"/>
+        </w:r>
+        <w:r>
+          <w:rPr>
+            <w:noProof/>
+            <w:webHidden/>
+          </w:rPr>
+          <w:instrText xml:space="preserve"> PAGEREF _Toc225846415 \h </w:instrText>
+        </w:r>
+        <w:r>
+          <w:rPr>
+            <w:noProof/>
+            <w:webHidden/>
+          </w:rPr>
+        </w:r>
+        <w:r>
+          <w:rPr>
+            <w:noProof/>
+            <w:webHidden/>
+          </w:rPr>
+          <w:fldChar w:fldCharType="separate"/>
+        </w:r>
+        <w:r>
+          <w:rPr>
+            <w:noProof/>
+            <w:webHidden/>
+          </w:rPr>
+          <w:t>10</w:t>
+        </w:r>
+        <w:r>
+          <w:rPr>
+            <w:noProof/>
+            <w:webHidden/>
+          </w:rPr>
+          <w:fldChar w:fldCharType="end"/>
+        </w:r>
+      </w:hyperlink>
     </w:p>
     <w:p>
       <w:pPr>
-        <w:spacing w:after="0"/>
+        <w:pStyle w:val="Seznamobrzk"/>
+        <w:tabs>
+          <w:tab w:val="right" w:leader="dot" w:pos="9061"/>
+        </w:tabs>
+        <w:rPr>
+          <w:rFonts w:asciiTheme="minorHAnsi" w:eastAsiaTheme="minorEastAsia" w:hAnsiTheme="minorHAnsi" w:cstheme="minorBidi"/>
+          <w:noProof/>
+          <w:color w:val="auto"/>
+          <w:sz w:val="24"/>
+        </w:rPr>
       </w:pPr>
-      <w:r>
-        <w:rPr>
-          <w:rFonts w:ascii="Times New Roman" w:eastAsia="Times New Roman" w:hAnsi="Times New Roman" w:cs="Times New Roman"/>
-          <w:sz w:val="24"/>
-        </w:rPr>
-        <w:t xml:space="preserve"> </w:t>
-      </w:r>
-    </w:p>
-    <w:p>
-      <w:pPr>
-        <w:spacing w:after="3046"/>
-      </w:pPr>
-      <w:r>
-        <w:rPr>
-          <w:rFonts w:ascii="Times New Roman" w:eastAsia="Times New Roman" w:hAnsi="Times New Roman" w:cs="Times New Roman"/>
-          <w:sz w:val="24"/>
-        </w:rPr>
-        <w:t xml:space="preserve"> </w:t>
-      </w:r>
+      <w:hyperlink w:anchor="_Toc225846416" w:history="1">
+        <w:r>
+          <w:rPr>
+            <w:rStyle w:val="Hypertextovodkaz"/>
+            <w:noProof/>
+          </w:rPr>
+          <w:t>Obrázek 2: Schéma HTTP protokolu</w:t>
+        </w:r>
+        <w:r>
+          <w:rPr>
+            <w:noProof/>
+            <w:webHidden/>
+          </w:rPr>
+          <w:tab/>
+        </w:r>
+        <w:r>
+          <w:rPr>
+            <w:noProof/>
+            <w:webHidden/>
+          </w:rPr>
+          <w:fldChar w:fldCharType="begin"/>
+        </w:r>
+        <w:r>
+          <w:rPr>
+            <w:noProof/>
+            <w:webHidden/>
+          </w:rPr>
+          <w:instrText xml:space="preserve"> PAGEREF _Toc225846416 \h </w:instrText>
+        </w:r>
+        <w:r>
+          <w:rPr>
+            <w:noProof/>
+            <w:webHidden/>
+          </w:rPr>
+        </w:r>
+        <w:r>
+          <w:rPr>
+            <w:noProof/>
+            <w:webHidden/>
+          </w:rPr>
+          <w:fldChar w:fldCharType="separate"/>
+        </w:r>
+        <w:r>
+          <w:rPr>
+            <w:noProof/>
+            <w:webHidden/>
+          </w:rPr>
+          <w:t>11</w:t>
+        </w:r>
+        <w:r>
+          <w:rPr>
+            <w:noProof/>
+            <w:webHidden/>
+          </w:rPr>
+          <w:fldChar w:fldCharType="end"/>
+        </w:r>
+      </w:hyperlink>
     </w:p>
     <w:p>
       <w:pPr>
@@ -14611,6 +15048,51 @@
         <w:ind w:left="-5" w:hanging="10"/>
       </w:pPr>
       <w:r>
+        <w:fldChar w:fldCharType="end"/>
+      </w:r>
+    </w:p>
+    <w:p>
+      <w:pPr>
+        <w:spacing w:after="164"/>
+        <w:ind w:left="-5" w:hanging="10"/>
+      </w:pPr>
+    </w:p>
+    <w:p>
+      <w:pPr>
+        <w:spacing w:after="164"/>
+        <w:ind w:left="-5" w:hanging="10"/>
+      </w:pPr>
+    </w:p>
+    <w:p>
+      <w:pPr>
+        <w:spacing w:after="164"/>
+        <w:ind w:left="-5" w:hanging="10"/>
+      </w:pPr>
+    </w:p>
+    <w:p>
+      <w:pPr>
+        <w:spacing w:after="164"/>
+        <w:ind w:left="-5" w:hanging="10"/>
+      </w:pPr>
+    </w:p>
+    <w:p>
+      <w:pPr>
+        <w:spacing w:after="164"/>
+        <w:ind w:left="-5" w:hanging="10"/>
+      </w:pPr>
+    </w:p>
+    <w:p>
+      <w:pPr>
+        <w:spacing w:after="164"/>
+        <w:ind w:left="-5" w:hanging="10"/>
+      </w:pPr>
+    </w:p>
+    <w:p>
+      <w:pPr>
+        <w:spacing w:after="164"/>
+        <w:ind w:left="-5" w:hanging="10"/>
+      </w:pPr>
+      <w:r>
         <w:rPr>
           <w:b/>
           <w:color w:val="EA7603"/>
@@ -14656,7 +15138,6 @@
           <w:rFonts w:ascii="Times New Roman" w:eastAsia="Times New Roman" w:hAnsi="Times New Roman" w:cs="Times New Roman"/>
           <w:sz w:val="24"/>
         </w:rPr>
-        <w:lastRenderedPageBreak/>
         <w:t xml:space="preserve"> </w:t>
       </w:r>
     </w:p>
@@ -14790,107 +15271,196 @@
         </w:tabs>
         <w:spacing w:after="0"/>
         <w:ind w:left="-15"/>
-      </w:pPr>
-      <w:r>
         <w:rPr>
           <w:rFonts w:ascii="Times New Roman" w:eastAsia="Times New Roman" w:hAnsi="Times New Roman" w:cs="Times New Roman"/>
           <w:sz w:val="24"/>
         </w:rPr>
-        <w:t xml:space="preserve">{Zkratka} </w:t>
-      </w:r>
+      </w:pPr>
       <w:r>
         <w:rPr>
           <w:rFonts w:ascii="Times New Roman" w:eastAsia="Times New Roman" w:hAnsi="Times New Roman" w:cs="Times New Roman"/>
           <w:sz w:val="24"/>
         </w:rPr>
+        <w:t xml:space="preserve">{Zkratka} </w:t>
+      </w:r>
+      <w:r>
+        <w:rPr>
+          <w:rFonts w:ascii="Times New Roman" w:eastAsia="Times New Roman" w:hAnsi="Times New Roman" w:cs="Times New Roman"/>
+          <w:sz w:val="24"/>
+        </w:rPr>
         <w:tab/>
         <w:t xml:space="preserve">{Popis zkratky} </w:t>
-      </w:r>
-      <w:r>
-        <w:rPr>
-          <w:rFonts w:ascii="Times New Roman" w:eastAsia="Times New Roman" w:hAnsi="Times New Roman" w:cs="Times New Roman"/>
-          <w:sz w:val="24"/>
-        </w:rPr>
-        <w:tab/>
-        <w:t xml:space="preserve"> </w:t>
       </w:r>
     </w:p>
     <w:p>
       <w:pPr>
+        <w:tabs>
+          <w:tab w:val="center" w:pos="2130"/>
+          <w:tab w:val="center" w:pos="4004"/>
+        </w:tabs>
         <w:spacing w:after="0"/>
-      </w:pPr>
-      <w:r>
+        <w:ind w:left="-15"/>
         <w:rPr>
           <w:rFonts w:ascii="Times New Roman" w:eastAsia="Times New Roman" w:hAnsi="Times New Roman" w:cs="Times New Roman"/>
           <w:sz w:val="24"/>
         </w:rPr>
-        <w:t xml:space="preserve"> </w:t>
+      </w:pPr>
+      <w:r>
+        <w:rPr>
+          <w:rFonts w:ascii="Times New Roman" w:eastAsia="Times New Roman" w:hAnsi="Times New Roman" w:cs="Times New Roman"/>
+          <w:sz w:val="24"/>
+        </w:rPr>
+        <w:t xml:space="preserve">ARM  </w:t>
       </w:r>
     </w:p>
     <w:p>
       <w:pPr>
-        <w:spacing w:after="2634"/>
-      </w:pPr>
-      <w:r>
+        <w:tabs>
+          <w:tab w:val="center" w:pos="2130"/>
+          <w:tab w:val="center" w:pos="4004"/>
+        </w:tabs>
+        <w:spacing w:after="0"/>
+        <w:ind w:left="-15"/>
         <w:rPr>
           <w:rFonts w:ascii="Times New Roman" w:eastAsia="Times New Roman" w:hAnsi="Times New Roman" w:cs="Times New Roman"/>
           <w:sz w:val="24"/>
         </w:rPr>
-        <w:t xml:space="preserve"> </w:t>
-      </w:r>
+      </w:pPr>
+      <w:proofErr w:type="spellStart"/>
+      <w:r>
+        <w:rPr>
+          <w:rFonts w:ascii="Times New Roman" w:eastAsia="Times New Roman" w:hAnsi="Times New Roman" w:cs="Times New Roman"/>
+          <w:sz w:val="24"/>
+        </w:rPr>
+        <w:t>IoT</w:t>
+      </w:r>
+      <w:proofErr w:type="spellEnd"/>
     </w:p>
     <w:p>
       <w:pPr>
+        <w:tabs>
+          <w:tab w:val="center" w:pos="2130"/>
+          <w:tab w:val="center" w:pos="4004"/>
+        </w:tabs>
         <w:spacing w:after="0"/>
-      </w:pPr>
-      <w:r>
+        <w:ind w:left="-15"/>
         <w:rPr>
           <w:rFonts w:ascii="Times New Roman" w:eastAsia="Times New Roman" w:hAnsi="Times New Roman" w:cs="Times New Roman"/>
           <w:sz w:val="24"/>
         </w:rPr>
-        <w:t xml:space="preserve"> </w:t>
-      </w:r>
+      </w:pPr>
       <w:r>
         <w:rPr>
           <w:rFonts w:ascii="Times New Roman" w:eastAsia="Times New Roman" w:hAnsi="Times New Roman" w:cs="Times New Roman"/>
           <w:sz w:val="24"/>
         </w:rPr>
-        <w:tab/>
-        <w:t xml:space="preserve"> </w:t>
+        <w:t>HTTP</w:t>
       </w:r>
     </w:p>
     <w:p>
       <w:pPr>
-        <w:spacing w:after="158"/>
-        <w:jc w:val="both"/>
-      </w:pPr>
-      <w:r>
+        <w:tabs>
+          <w:tab w:val="center" w:pos="2130"/>
+          <w:tab w:val="center" w:pos="4004"/>
+        </w:tabs>
+        <w:spacing w:after="0"/>
+        <w:ind w:left="-15"/>
         <w:rPr>
           <w:rFonts w:ascii="Times New Roman" w:eastAsia="Times New Roman" w:hAnsi="Times New Roman" w:cs="Times New Roman"/>
           <w:sz w:val="24"/>
         </w:rPr>
-        <w:t xml:space="preserve"> </w:t>
-      </w:r>
+      </w:pPr>
     </w:p>
     <w:p>
       <w:pPr>
+        <w:tabs>
+          <w:tab w:val="center" w:pos="2130"/>
+          <w:tab w:val="center" w:pos="4004"/>
+        </w:tabs>
         <w:spacing w:after="0"/>
-        <w:jc w:val="both"/>
-      </w:pPr>
-      <w:r>
+        <w:ind w:left="-15"/>
         <w:rPr>
           <w:rFonts w:ascii="Times New Roman" w:eastAsia="Times New Roman" w:hAnsi="Times New Roman" w:cs="Times New Roman"/>
           <w:sz w:val="24"/>
         </w:rPr>
-        <w:t xml:space="preserve"> </w:t>
-      </w:r>
+      </w:pPr>
     </w:p>
     <w:p>
       <w:pPr>
+        <w:tabs>
+          <w:tab w:val="center" w:pos="2130"/>
+          <w:tab w:val="center" w:pos="4004"/>
+        </w:tabs>
+        <w:spacing w:after="0"/>
+        <w:rPr>
+          <w:rFonts w:ascii="Times New Roman" w:eastAsia="Times New Roman" w:hAnsi="Times New Roman" w:cs="Times New Roman"/>
+          <w:sz w:val="24"/>
+        </w:rPr>
+      </w:pPr>
+    </w:p>
+    <w:p>
+      <w:pPr>
+        <w:tabs>
+          <w:tab w:val="center" w:pos="2130"/>
+          <w:tab w:val="center" w:pos="4004"/>
+        </w:tabs>
+        <w:spacing w:after="0"/>
+        <w:rPr>
+          <w:rFonts w:ascii="Times New Roman" w:eastAsia="Times New Roman" w:hAnsi="Times New Roman" w:cs="Times New Roman"/>
+          <w:sz w:val="24"/>
+        </w:rPr>
+      </w:pPr>
+    </w:p>
+    <w:p>
+      <w:pPr>
+        <w:tabs>
+          <w:tab w:val="center" w:pos="2130"/>
+          <w:tab w:val="center" w:pos="4004"/>
+        </w:tabs>
+        <w:spacing w:after="0"/>
+        <w:rPr>
+          <w:rFonts w:ascii="Times New Roman" w:eastAsia="Times New Roman" w:hAnsi="Times New Roman" w:cs="Times New Roman"/>
+          <w:sz w:val="24"/>
+        </w:rPr>
+      </w:pPr>
+    </w:p>
+    <w:p>
+      <w:pPr>
+        <w:tabs>
+          <w:tab w:val="center" w:pos="2130"/>
+          <w:tab w:val="center" w:pos="4004"/>
+        </w:tabs>
+        <w:spacing w:after="0"/>
+        <w:rPr>
+          <w:rFonts w:ascii="Times New Roman" w:eastAsia="Times New Roman" w:hAnsi="Times New Roman" w:cs="Times New Roman"/>
+          <w:sz w:val="24"/>
+        </w:rPr>
+      </w:pPr>
+    </w:p>
+    <w:p>
+      <w:pPr>
+        <w:tabs>
+          <w:tab w:val="center" w:pos="2130"/>
+          <w:tab w:val="center" w:pos="4004"/>
+        </w:tabs>
+        <w:spacing w:after="0"/>
+        <w:rPr>
+          <w:rFonts w:ascii="Times New Roman" w:eastAsia="Times New Roman" w:hAnsi="Times New Roman" w:cs="Times New Roman"/>
+          <w:sz w:val="24"/>
+        </w:rPr>
+      </w:pPr>
+    </w:p>
+    <w:p>
+      <w:pPr>
+        <w:tabs>
+          <w:tab w:val="center" w:pos="2130"/>
+          <w:tab w:val="center" w:pos="4004"/>
+        </w:tabs>
+        <w:spacing w:after="0"/>
         <w:sectPr>
-          <w:footerReference w:type="even" r:id="rId8"/>
-          <w:footerReference w:type="default" r:id="rId9"/>
-          <w:footerReference w:type="first" r:id="rId10"/>
+          <w:footerReference w:type="even" r:id="rId9"/>
+          <w:footerReference w:type="default" r:id="rId10"/>
+          <w:footerReference w:type="first" r:id="rId11"/>
           <w:pgSz w:w="11906" w:h="16838"/>
           <w:pgMar w:top="1028" w:right="1416" w:bottom="889" w:left="1419" w:header="708" w:footer="708" w:gutter="0"/>
           <w:cols w:space="708"/>
@@ -15112,7 +15682,7 @@
       <w:pPr>
         <w:pStyle w:val="Nadpis1"/>
       </w:pPr>
-      <w:bookmarkStart w:id="0" w:name="_Toc213609420"/>
+      <w:bookmarkStart w:id="0" w:name="_Toc225844738"/>
       <w:r>
         <w:lastRenderedPageBreak/>
         <w:t xml:space="preserve">1. </w:t>
@@ -15132,7 +15702,7 @@
       <w:pPr>
         <w:pStyle w:val="Nadpis2"/>
       </w:pPr>
-      <w:bookmarkStart w:id="1" w:name="_Toc213609421"/>
+      <w:bookmarkStart w:id="1" w:name="_Toc225844739"/>
       <w:r>
         <w:t>1</w:t>
       </w:r>
@@ -15198,7 +15768,13 @@
         <w:t xml:space="preserve"> PI a Orange PI díky jejich bohatému I/O a výkonu.</w:t>
       </w:r>
       <w:r>
-        <w:t xml:space="preserve"> Mezi zařízeními s větším výkonem už nebývá tolik rozdílů, které by hovořili pro jednu či druhou variantu, proto je zcela nepodstatné, které nakonec vybereme. Pro tuto práci byl zvolen </w:t>
+        <w:t xml:space="preserve"> Mezi zařízeními s větším výkonem už nebývá tolik rozdílů, které by hovořili pro jednu či druhou variantu, proto </w:t>
+      </w:r>
+      <w:r>
+        <w:t xml:space="preserve">se můžeme orientovat situací na trhu a dané cenně za kus. </w:t>
+      </w:r>
+      <w:r>
+        <w:t xml:space="preserve">Pro tuto práci byl zvolen </w:t>
       </w:r>
       <w:r>
         <w:t xml:space="preserve">počítač </w:t>
@@ -15544,7 +16120,7 @@
           <w:lang w:eastAsia="en-GB"/>
         </w:rPr>
       </w:pPr>
-      <w:bookmarkStart w:id="2" w:name="_Toc213609422"/>
+      <w:bookmarkStart w:id="2" w:name="_Toc225844740"/>
       <w:r>
         <w:rPr>
           <w:lang w:eastAsia="en-GB"/>
@@ -15896,116 +16472,764 @@
     </w:p>
     <w:p>
       <w:pPr>
+        <w:rPr>
+          <w:lang w:eastAsia="en-GB"/>
+        </w:rPr>
+      </w:pPr>
+    </w:p>
+    <w:p>
+      <w:pPr>
+        <w:rPr>
+          <w:lang w:eastAsia="en-GB"/>
+        </w:rPr>
+      </w:pPr>
+    </w:p>
+    <w:p>
+      <w:pPr>
+        <w:rPr>
+          <w:lang w:eastAsia="en-GB"/>
+        </w:rPr>
+      </w:pPr>
+    </w:p>
+    <w:p>
+      <w:pPr>
+        <w:rPr>
+          <w:lang w:eastAsia="en-GB"/>
+        </w:rPr>
+      </w:pPr>
+    </w:p>
+    <w:p>
+      <w:pPr>
+        <w:rPr>
+          <w:lang w:eastAsia="en-GB"/>
+        </w:rPr>
+      </w:pPr>
+    </w:p>
+    <w:p>
+      <w:pPr>
+        <w:rPr>
+          <w:lang w:eastAsia="en-GB"/>
+        </w:rPr>
+      </w:pPr>
+    </w:p>
+    <w:p>
+      <w:pPr>
         <w:pStyle w:val="Nadpis2"/>
         <w:rPr>
           <w:lang w:eastAsia="en-GB"/>
         </w:rPr>
       </w:pPr>
-      <w:bookmarkStart w:id="3" w:name="_Toc213609423"/>
+      <w:bookmarkStart w:id="3" w:name="_Toc225844741"/>
       <w:r>
         <w:rPr>
           <w:lang w:eastAsia="en-GB"/>
         </w:rPr>
+        <w:lastRenderedPageBreak/>
         <w:t>1.3 Webový framework</w:t>
       </w:r>
       <w:bookmarkEnd w:id="3"/>
     </w:p>
     <w:p>
+      <w:r>
+        <w:t>Webový framework je softwarová platforma, která usnadňuje a urychluje vývoj webových aplikací. Poskytuje strukturu a sadu nástrojů, knihoven a</w:t>
+      </w:r>
+      <w:r>
+        <w:t xml:space="preserve"> pravidel</w:t>
+      </w:r>
+      <w:r>
+        <w:t>, které pomáhají vývojářům vytvářet kvalitní</w:t>
+      </w:r>
+      <w:r>
+        <w:t xml:space="preserve"> a </w:t>
+      </w:r>
+      <w:r>
+        <w:t>udržovatelný. Frameworky obvykle zajišťují základní funkcionality, jako je směrování (</w:t>
+      </w:r>
+      <w:proofErr w:type="spellStart"/>
+      <w:r>
+        <w:t>routing</w:t>
+      </w:r>
+      <w:proofErr w:type="spellEnd"/>
+      <w:r>
+        <w:t xml:space="preserve">), práce s databází, autentizace uživatelů </w:t>
+      </w:r>
+      <w:r>
+        <w:t>nebo například</w:t>
+      </w:r>
+      <w:r>
+        <w:t xml:space="preserve"> </w:t>
+      </w:r>
+      <w:r>
+        <w:t>cáchování dat</w:t>
+      </w:r>
+      <w:r>
+        <w:t xml:space="preserve">. </w:t>
+      </w:r>
+      <w:r>
+        <w:t>Tyto frameworky otevřeli cestu k </w:t>
+      </w:r>
+      <w:r>
+        <w:t>rychlejšímu,</w:t>
+      </w:r>
+      <w:r>
+        <w:t xml:space="preserve"> a především snadnějšímu vývoji webových aplikací</w:t>
+      </w:r>
+      <w:r>
+        <w:t xml:space="preserve">. V posledních letech se rozmohl vývoj </w:t>
+      </w:r>
+      <w:proofErr w:type="spellStart"/>
+      <w:r>
+        <w:t>JavaScriptu</w:t>
+      </w:r>
+      <w:proofErr w:type="spellEnd"/>
+      <w:r>
+        <w:t xml:space="preserve"> a jeho frameworků, které se dnes používají v mnoha aplikacích. Mezi nejznámější patří </w:t>
+      </w:r>
+      <w:proofErr w:type="spellStart"/>
+      <w:r>
+        <w:t>React</w:t>
+      </w:r>
+      <w:proofErr w:type="spellEnd"/>
+      <w:r>
+        <w:t xml:space="preserve"> nebo Vue.js</w:t>
+      </w:r>
+      <w:r>
+        <w:t xml:space="preserve">. Nakonec jsem použil framework </w:t>
+      </w:r>
+      <w:proofErr w:type="spellStart"/>
+      <w:r>
+        <w:t>Flask</w:t>
+      </w:r>
+      <w:proofErr w:type="spellEnd"/>
+      <w:r>
+        <w:t xml:space="preserve"> v jazyce Python.</w:t>
+      </w:r>
+      <w:r>
+        <w:t xml:space="preserve"> </w:t>
+      </w:r>
+    </w:p>
+    <w:p/>
+    <w:p>
       <w:pPr>
-        <w:spacing w:after="401"/>
-        <w:rPr>
-          <w:lang w:eastAsia="en-GB"/>
-        </w:rPr>
+        <w:keepNext/>
+        <w:jc w:val="center"/>
       </w:pPr>
+      <w:r>
+        <w:rPr>
+          <w:noProof/>
+        </w:rPr>
+        <w:drawing>
+          <wp:inline distT="0" distB="0" distL="0" distR="0" wp14:anchorId="690243D8" wp14:editId="6ED1149D">
+            <wp:extent cx="5747385" cy="2874010"/>
+            <wp:effectExtent l="0" t="0" r="5715" b="2540"/>
+            <wp:docPr id="1674688508" name="Obrázek 265" descr="Modern Web Application Architecture: Types, Components, Layers"/>
+            <wp:cNvGraphicFramePr>
+              <a:graphicFrameLocks xmlns:a="http://schemas.openxmlformats.org/drawingml/2006/main" noChangeAspect="1"/>
+            </wp:cNvGraphicFramePr>
+            <a:graphic xmlns:a="http://schemas.openxmlformats.org/drawingml/2006/main">
+              <a:graphicData uri="http://schemas.openxmlformats.org/drawingml/2006/picture">
+                <pic:pic xmlns:pic="http://schemas.openxmlformats.org/drawingml/2006/picture">
+                  <pic:nvPicPr>
+                    <pic:cNvPr id="0" name="Picture 1" descr="Modern Web Application Architecture: Types, Components, Layers"/>
+                    <pic:cNvPicPr>
+                      <a:picLocks noChangeAspect="1" noChangeArrowheads="1"/>
+                    </pic:cNvPicPr>
+                  </pic:nvPicPr>
+                  <pic:blipFill>
+                    <a:blip r:embed="rId12">
+                      <a:extLst>
+                        <a:ext uri="{28A0092B-C50C-407E-A947-70E740481C1C}">
+                          <a14:useLocalDpi xmlns:a14="http://schemas.microsoft.com/office/drawing/2010/main" val="0"/>
+                        </a:ext>
+                      </a:extLst>
+                    </a:blip>
+                    <a:srcRect/>
+                    <a:stretch>
+                      <a:fillRect/>
+                    </a:stretch>
+                  </pic:blipFill>
+                  <pic:spPr bwMode="auto">
+                    <a:xfrm>
+                      <a:off x="0" y="0"/>
+                      <a:ext cx="5747385" cy="2874010"/>
+                    </a:xfrm>
+                    <a:prstGeom prst="rect">
+                      <a:avLst/>
+                    </a:prstGeom>
+                    <a:noFill/>
+                    <a:ln>
+                      <a:noFill/>
+                    </a:ln>
+                  </pic:spPr>
+                </pic:pic>
+              </a:graphicData>
+            </a:graphic>
+          </wp:inline>
+        </w:drawing>
+      </w:r>
     </w:p>
     <w:p>
-      <w:r>
-        <w:t>Webový framework je softwarová platforma, která usnadňuje a urychluje vývoj webových aplikací. Poskytuje strukturu a sadu nástrojů, knihoven a</w:t>
-      </w:r>
-      <w:r>
-        <w:t xml:space="preserve"> pravidel</w:t>
-      </w:r>
-      <w:r>
-        <w:t>, které pomáhají vývojářům vytvářet kvalitní</w:t>
-      </w:r>
-      <w:r>
-        <w:t xml:space="preserve"> a </w:t>
-      </w:r>
-      <w:r>
-        <w:t>udržovatelný. Frameworky obvykle zajišťují základní funkcionality, jako je směrování (</w:t>
+      <w:pPr>
+        <w:pStyle w:val="Titulek"/>
+        <w:jc w:val="center"/>
+      </w:pPr>
+      <w:bookmarkStart w:id="4" w:name="_Toc225846415"/>
+      <w:r>
+        <w:t xml:space="preserve">Obrázek </w:t>
+      </w:r>
+      <w:r>
+        <w:fldChar w:fldCharType="begin"/>
+      </w:r>
+      <w:r>
+        <w:instrText xml:space="preserve"> SEQ Obrázek \* ARABIC </w:instrText>
+      </w:r>
+      <w:r>
+        <w:fldChar w:fldCharType="separate"/>
+      </w:r>
+      <w:r>
+        <w:rPr>
+          <w:noProof/>
+        </w:rPr>
+        <w:t>1</w:t>
+      </w:r>
+      <w:r>
+        <w:fldChar w:fldCharType="end"/>
+      </w:r>
+      <w:r>
+        <w:t>: Schéma webové stránky</w:t>
+      </w:r>
+      <w:bookmarkEnd w:id="4"/>
+    </w:p>
+    <w:p>
+      <w:pPr>
+        <w:pStyle w:val="Nadpis2"/>
+        <w:ind w:left="0" w:firstLine="0"/>
+      </w:pPr>
+      <w:bookmarkStart w:id="5" w:name="_Toc225844742"/>
+      <w:r>
+        <w:t xml:space="preserve">1.4 </w:t>
       </w:r>
       <w:proofErr w:type="spellStart"/>
       <w:r>
+        <w:t>Flask</w:t>
+      </w:r>
+      <w:bookmarkEnd w:id="5"/>
+      <w:proofErr w:type="spellEnd"/>
+    </w:p>
+    <w:p>
+      <w:proofErr w:type="spellStart"/>
+      <w:r>
+        <w:t>Flask</w:t>
+      </w:r>
+      <w:proofErr w:type="spellEnd"/>
+      <w:r>
+        <w:t xml:space="preserve"> je populární mikro-framework pro vývoj webových aplikací v jazyce Python, který sází na jednoduchost a flexibilitu. Na rozdíl od robustnějších nástrojů (jako je </w:t>
+      </w:r>
+      <w:proofErr w:type="spellStart"/>
+      <w:r>
+        <w:t>Django</w:t>
+      </w:r>
+      <w:proofErr w:type="spellEnd"/>
+      <w:r>
+        <w:t xml:space="preserve">) nenutí vývojáře používat konkrétní strukturu složek nebo konkrétní databáze, což z něj dělá ideální volbu pro menší projekty, </w:t>
+      </w:r>
+      <w:proofErr w:type="spellStart"/>
+      <w:r>
+        <w:t>mikroslužby</w:t>
+      </w:r>
+      <w:proofErr w:type="spellEnd"/>
+      <w:r>
+        <w:t xml:space="preserve"> nebo rychlé prototypování. </w:t>
+      </w:r>
+      <w:proofErr w:type="spellStart"/>
+      <w:r>
+        <w:t>Flask</w:t>
+      </w:r>
+      <w:proofErr w:type="spellEnd"/>
+      <w:r>
+        <w:t xml:space="preserve"> poskytuje pouze nezbytné jádro pro směrování (</w:t>
+      </w:r>
+      <w:proofErr w:type="spellStart"/>
+      <w:r>
         <w:t>routing</w:t>
       </w:r>
       <w:proofErr w:type="spellEnd"/>
       <w:r>
-        <w:t xml:space="preserve">), práce s databází, autentizace uživatelů </w:t>
-      </w:r>
-      <w:r>
-        <w:t>nebo například</w:t>
-      </w:r>
+        <w:t xml:space="preserve">) a zpracování HTTP požadavků, zatímco vše ostatní – od autentizace až po práci s databázemi – lze snadno přidat pomocí široké škály rozšíření. Díky své „minimalistické“ povaze a snadné čitelnosti kódu je </w:t>
+      </w:r>
+      <w:proofErr w:type="spellStart"/>
+      <w:r>
+        <w:t>Flask</w:t>
+      </w:r>
+      <w:proofErr w:type="spellEnd"/>
+      <w:r>
+        <w:t xml:space="preserve"> nesmírně oblíbený mezi začátečníky, kteří se chtějí rychle naučit základy webového vývoje, i mezi profesionály, kteří vyžadují plnou kontrolu nad každou komponentou své aplikace.</w:t>
+      </w:r>
+    </w:p>
+    <w:p/>
+    <w:p/>
+    <w:p/>
+    <w:p>
+      <w:pPr>
+        <w:pStyle w:val="Nadpis2"/>
+      </w:pPr>
+      <w:bookmarkStart w:id="6" w:name="_Toc225844743"/>
+      <w:r>
+        <w:lastRenderedPageBreak/>
+        <w:t>1.5 HTTP protokol</w:t>
+      </w:r>
+      <w:bookmarkEnd w:id="6"/>
+    </w:p>
+    <w:p>
+      <w:r>
+        <w:t>Moderní systémy automatizace a řízení budov dnes prioritně využívají architekturu klient-server, která tvoří robustní základ pro interakci mezi koncovým uživatelem a řídicím uzlem. Tato komunikace je realizována prostřednictvím protokolu HTTP (</w:t>
+      </w:r>
+      <w:r>
+        <w:rPr>
+          <w:i/>
+          <w:iCs/>
+        </w:rPr>
+        <w:t xml:space="preserve">Hypertext Transfer </w:t>
+      </w:r>
+      <w:proofErr w:type="spellStart"/>
+      <w:r>
+        <w:rPr>
+          <w:i/>
+          <w:iCs/>
+        </w:rPr>
+        <w:t>Protocol</w:t>
+      </w:r>
+      <w:proofErr w:type="spellEnd"/>
+      <w:r>
+        <w:t xml:space="preserve">), jenž funguje na principu </w:t>
+      </w:r>
+      <w:proofErr w:type="spellStart"/>
+      <w:r>
+        <w:t>request</w:t>
+      </w:r>
+      <w:proofErr w:type="spellEnd"/>
+      <w:r>
+        <w:t>-response cyklu. V tomto modelu vystupuje klientské zařízení (např. webový prohlížeč) jako iniciátor požadavku, který je následně zpracován serverovou částí systému. Server požadavek validuje, provede příslušnou logickou operaci a vrací strukturovanou odpověď obsahující stavový kód a případná data.</w:t>
+      </w:r>
+    </w:p>
+    <w:p>
+      <w:r>
+        <w:t>Z hlediska funkčnosti jsou pro ovládání technických zařízení klíčové zejména dvě HTTP metody:</w:t>
+      </w:r>
+    </w:p>
+    <w:p>
+      <w:pPr>
+        <w:numPr>
+          <w:ilvl w:val="0"/>
+          <w:numId w:val="6"/>
+        </w:numPr>
+      </w:pPr>
+      <w:r>
+        <w:t xml:space="preserve">GET: </w:t>
+      </w:r>
+      <w:proofErr w:type="spellStart"/>
+      <w:r>
+        <w:t>Semanticky</w:t>
+      </w:r>
+      <w:proofErr w:type="spellEnd"/>
+      <w:r>
+        <w:t xml:space="preserve"> určená pro bezpečné a </w:t>
+      </w:r>
+      <w:proofErr w:type="spellStart"/>
+      <w:r>
+        <w:t>idempotentní</w:t>
+      </w:r>
+      <w:proofErr w:type="spellEnd"/>
+      <w:r>
+        <w:t xml:space="preserve"> získávání informací (např. dotaz na aktuální teplotu v místnosti nebo stav osvětlení), aniž by docházelo k modifikaci stavu systému.</w:t>
+      </w:r>
+    </w:p>
+    <w:p>
+      <w:pPr>
+        <w:numPr>
+          <w:ilvl w:val="0"/>
+          <w:numId w:val="6"/>
+        </w:numPr>
+      </w:pPr>
+      <w:r>
+        <w:t>POST: Využívaná k přenosu dat, která vyvolávají změnu na straně serveru (např. odeslání příkazu k sepnutí akčního členu nebo aktualizaci konfiguračních parametrů).</w:t>
+      </w:r>
+    </w:p>
+    <w:p>
+      <w:r>
+        <w:t xml:space="preserve">Zásadním aspektem protokolu HTTP je jeho </w:t>
+      </w:r>
+      <w:proofErr w:type="spellStart"/>
+      <w:r>
+        <w:t>bezstavovost</w:t>
+      </w:r>
+      <w:proofErr w:type="spellEnd"/>
+      <w:r>
+        <w:t xml:space="preserve"> (</w:t>
+      </w:r>
+      <w:proofErr w:type="spellStart"/>
+      <w:r>
+        <w:rPr>
+          <w:i/>
+          <w:iCs/>
+        </w:rPr>
+        <w:t>statelessness</w:t>
+      </w:r>
+      <w:proofErr w:type="spellEnd"/>
+      <w:r>
+        <w:t>). Tato vlastnost implikuje, že server neuchovává kontext mezi jednotlivými transakcemi, což vede k vyšší odolnosti systému vůči výpadkům spojení a usnadňuje škálovatelnost. Volba webového rozhraní jako primárního kontrolního bodu je strategickým rozhodnutím, které zajišťuje vysokou míru interoperability. Díky využití standardizovaných internetových protokolů se systém stává nezávislým na konkrétní platformě či operačním systému, čímž odpadá nutnost vývoje nativních aplikací a uživateli je umožněn přístup z libovolného terminálu vybaveného standardním prohlížečem.</w:t>
+      </w:r>
+    </w:p>
+    <w:p/>
+    <w:p>
+      <w:pPr>
+        <w:keepNext/>
+        <w:jc w:val="center"/>
+      </w:pPr>
+      <w:r>
+        <w:rPr>
+          <w:noProof/>
+        </w:rPr>
+        <w:drawing>
+          <wp:inline distT="0" distB="0" distL="0" distR="0" wp14:anchorId="0BBAD1C8" wp14:editId="4B4FC43A">
+            <wp:extent cx="2895600" cy="1571625"/>
+            <wp:effectExtent l="0" t="0" r="0" b="9525"/>
+            <wp:docPr id="1008331677" name="Obrázek 266"/>
+            <wp:cNvGraphicFramePr>
+              <a:graphicFrameLocks xmlns:a="http://schemas.openxmlformats.org/drawingml/2006/main" noChangeAspect="1"/>
+            </wp:cNvGraphicFramePr>
+            <a:graphic xmlns:a="http://schemas.openxmlformats.org/drawingml/2006/main">
+              <a:graphicData uri="http://schemas.openxmlformats.org/drawingml/2006/picture">
+                <pic:pic xmlns:pic="http://schemas.openxmlformats.org/drawingml/2006/picture">
+                  <pic:nvPicPr>
+                    <pic:cNvPr id="0" name="Picture 3"/>
+                    <pic:cNvPicPr>
+                      <a:picLocks noChangeAspect="1" noChangeArrowheads="1"/>
+                    </pic:cNvPicPr>
+                  </pic:nvPicPr>
+                  <pic:blipFill>
+                    <a:blip r:embed="rId13">
+                      <a:extLst>
+                        <a:ext uri="{28A0092B-C50C-407E-A947-70E740481C1C}">
+                          <a14:useLocalDpi xmlns:a14="http://schemas.microsoft.com/office/drawing/2010/main" val="0"/>
+                        </a:ext>
+                      </a:extLst>
+                    </a:blip>
+                    <a:srcRect/>
+                    <a:stretch>
+                      <a:fillRect/>
+                    </a:stretch>
+                  </pic:blipFill>
+                  <pic:spPr bwMode="auto">
+                    <a:xfrm>
+                      <a:off x="0" y="0"/>
+                      <a:ext cx="2895600" cy="1571625"/>
+                    </a:xfrm>
+                    <a:prstGeom prst="rect">
+                      <a:avLst/>
+                    </a:prstGeom>
+                    <a:noFill/>
+                    <a:ln>
+                      <a:noFill/>
+                    </a:ln>
+                  </pic:spPr>
+                </pic:pic>
+              </a:graphicData>
+            </a:graphic>
+          </wp:inline>
+        </w:drawing>
+      </w:r>
+    </w:p>
+    <w:p>
+      <w:pPr>
+        <w:pStyle w:val="Titulek"/>
+        <w:jc w:val="center"/>
+      </w:pPr>
+      <w:bookmarkStart w:id="7" w:name="_Toc225846416"/>
+      <w:r>
+        <w:t xml:space="preserve">Obrázek </w:t>
+      </w:r>
+      <w:r>
+        <w:fldChar w:fldCharType="begin"/>
+      </w:r>
+      <w:r>
+        <w:instrText xml:space="preserve"> SEQ Obrázek \* ARABIC </w:instrText>
+      </w:r>
+      <w:r>
+        <w:fldChar w:fldCharType="separate"/>
+      </w:r>
+      <w:r>
+        <w:rPr>
+          <w:noProof/>
+        </w:rPr>
+        <w:t>2</w:t>
+      </w:r>
+      <w:r>
+        <w:fldChar w:fldCharType="end"/>
+      </w:r>
+      <w:r>
+        <w:t>: Schéma HTTP protokolu</w:t>
+      </w:r>
+      <w:bookmarkEnd w:id="7"/>
+    </w:p>
+    <w:p/>
+    <w:p/>
+    <w:p/>
+    <w:p/>
+    <w:p/>
+    <w:p>
+      <w:pPr>
+        <w:pStyle w:val="Nadpis2"/>
+      </w:pPr>
+      <w:bookmarkStart w:id="8" w:name="_Toc225844744"/>
+      <w:r>
+        <w:lastRenderedPageBreak/>
+        <w:t>1.6 ESP32</w:t>
+      </w:r>
+      <w:bookmarkEnd w:id="8"/>
+    </w:p>
+    <w:p>
+      <w:r>
+        <w:t>Zatímco výkonné jednodeskové počítače přebírají v rámci hierarchie inteligentních budov roli centrálních serverů a bran, pro samotn</w:t>
+      </w:r>
+      <w:r>
+        <w:t>ý sběr</w:t>
+      </w:r>
+      <w:r>
+        <w:t xml:space="preserve"> dat z fyzického prostředí a přímou interakci s periferiemi se využívají specializované mikrokontrolery. V současném </w:t>
+      </w:r>
+      <w:r>
+        <w:t xml:space="preserve">světě </w:t>
+      </w:r>
+      <w:r>
+        <w:t xml:space="preserve">internetu věcí zaujímá dominantní postavení čipová sada ESP32 od společnosti </w:t>
+      </w:r>
+      <w:proofErr w:type="spellStart"/>
+      <w:r>
+        <w:t>Espressif</w:t>
+      </w:r>
+      <w:proofErr w:type="spellEnd"/>
+      <w:r>
+        <w:t xml:space="preserve"> Systems. Jedná se o vysoce integrovaný systém na čipu</w:t>
+      </w:r>
+      <w:r>
+        <w:t xml:space="preserve">, </w:t>
+      </w:r>
+      <w:r>
+        <w:t>který v rámci jediného pouzdra kombinuje výpočetní jednotku s nízkoenergetickými bezdrátovými technologiemi Wi-Fi a Bluetooth</w:t>
+      </w:r>
+      <w:r>
+        <w:t>.</w:t>
+      </w:r>
+    </w:p>
+    <w:p>
+      <w:r>
+        <w:t>Implementace platformy ESP32 do projektů chytré domácnosti je podložena několika klíčovými technickými parametry:</w:t>
+      </w:r>
+    </w:p>
+    <w:p>
+      <w:pPr>
+        <w:numPr>
+          <w:ilvl w:val="0"/>
+          <w:numId w:val="8"/>
+        </w:numPr>
+      </w:pPr>
+      <w:r>
+        <w:t xml:space="preserve">Energetická efektivita: Čip disponuje pokročilým managementem napájení, včetně režimu </w:t>
+      </w:r>
+      <w:proofErr w:type="spellStart"/>
+      <w:r>
+        <w:t>deep</w:t>
+      </w:r>
+      <w:proofErr w:type="spellEnd"/>
       <w:r>
         <w:t xml:space="preserve"> </w:t>
       </w:r>
-      <w:r>
-        <w:t>cáchování dat</w:t>
+      <w:proofErr w:type="spellStart"/>
+      <w:r>
+        <w:t>sleep</w:t>
+      </w:r>
+      <w:proofErr w:type="spellEnd"/>
+      <w:r>
+        <w:t>, v němž spotřeba klesá do řádů jednotek mikroampér</w:t>
       </w:r>
       <w:r>
         <w:t xml:space="preserve">. </w:t>
       </w:r>
       <w:r>
-        <w:t>Tyto frameworky otevřeli cestu k </w:t>
-      </w:r>
-      <w:r>
-        <w:t>rychlejšímu,</w:t>
-      </w:r>
-      <w:r>
-        <w:t xml:space="preserve"> a především snadnějšímu vývoji webových aplikací</w:t>
-      </w:r>
-      <w:r>
-        <w:t xml:space="preserve">. V posledních letech se rozmohl vývoj </w:t>
+        <w:t xml:space="preserve">Tato vlastnost je </w:t>
+      </w:r>
+      <w:r>
+        <w:t xml:space="preserve">důležitá </w:t>
+      </w:r>
+      <w:r>
+        <w:t xml:space="preserve">pro nasazení </w:t>
+      </w:r>
+      <w:r>
+        <w:t>samostatných uzlů</w:t>
+      </w:r>
+      <w:r>
+        <w:t xml:space="preserve"> napájených z bateriových článků, u nichž lze dosáhnout provozní životnosti v řádu měsíců až let.</w:t>
+      </w:r>
+    </w:p>
+    <w:p>
+      <w:pPr>
+        <w:numPr>
+          <w:ilvl w:val="0"/>
+          <w:numId w:val="8"/>
+        </w:numPr>
+      </w:pPr>
+      <w:r>
+        <w:t>Výpočetní výkon a bezpečnost: Architektura založená na dvoujádrovém procesoru s nastavitelnou taktovací frekvencí až 240 MHz poskytuje dostatečnou rezervu pro realizaci asymetrického šifrování (např. TLS/SSL) a lokální předzpracování signálu (</w:t>
       </w:r>
       <w:proofErr w:type="spellStart"/>
       <w:r>
-        <w:t>JavaScriptu</w:t>
+        <w:t>edge</w:t>
       </w:r>
       <w:proofErr w:type="spellEnd"/>
       <w:r>
-        <w:t xml:space="preserve"> a jeho frameworků, které se dnes používají v mnoha aplikacích. Mezi nejznámější patří </w:t>
+        <w:t xml:space="preserve"> </w:t>
       </w:r>
       <w:proofErr w:type="spellStart"/>
       <w:r>
-        <w:t>React</w:t>
+        <w:t>computing</w:t>
       </w:r>
       <w:proofErr w:type="spellEnd"/>
       <w:r>
-        <w:t xml:space="preserve"> nebo Vue.js</w:t>
-      </w:r>
-      <w:r>
-        <w:t xml:space="preserve">. Nakonec jsem použil framework </w:t>
-      </w:r>
-      <w:proofErr w:type="spellStart"/>
-      <w:r>
-        <w:t>Flask</w:t>
-      </w:r>
-      <w:proofErr w:type="spellEnd"/>
-      <w:r>
-        <w:t xml:space="preserve"> v jazyce Python.</w:t>
-      </w:r>
+        <w:t>), což snižuje datovou zátěž přenášenou na centrální server.</w:t>
+      </w:r>
+    </w:p>
+    <w:p>
+      <w:pPr>
+        <w:numPr>
+          <w:ilvl w:val="0"/>
+          <w:numId w:val="8"/>
+        </w:numPr>
+      </w:pPr>
+      <w:r>
+        <w:t xml:space="preserve">Periferní konektivita a rozšiřitelnost: Integrovaná paleta hardwarových rozhraní, zahrnující standardy I2C, SPI, UART a vícekanálové ADC/DAC </w:t>
+      </w:r>
+      <w:proofErr w:type="gramStart"/>
+      <w:r>
+        <w:t>převodníky</w:t>
+      </w:r>
+      <w:r>
+        <w:t>(</w:t>
+      </w:r>
+      <w:proofErr w:type="gramEnd"/>
+      <w:r>
+        <w:t>většinou jako příslušenství)</w:t>
+      </w:r>
+      <w:r>
+        <w:t xml:space="preserve">, umožňuje bezprostřední integraci širokého spektra senzorických prvků pro monitoring environmentálních veličin (teplota, relativní vlhkost, koncentrace </w:t>
+      </w:r>
+      <w:r>
+        <w:t>CO2</w:t>
+      </w:r>
+      <w:r>
+        <w:t>) i ovládání výkonových akčních členů.</w:t>
+      </w:r>
+    </w:p>
+    <w:p>
+      <w:pPr>
+        <w:ind w:left="720"/>
+      </w:pPr>
     </w:p>
     <w:p>
       <w:pPr>
         <w:pStyle w:val="Nadpis2"/>
       </w:pPr>
+      <w:bookmarkStart w:id="9" w:name="_Toc225844745"/>
+      <w:r>
+        <w:t>1.6 M5stack</w:t>
+      </w:r>
+      <w:bookmarkEnd w:id="9"/>
+    </w:p>
+    <w:p>
+      <w:r>
+        <w:t>Platforma M5Stack představuje pokročilý ekosystém založený na čipu ESP32, který integruje mikrokontroler do kompaktního průmyslového pouzdra. Na rozdíl od běžných vývojových desek nabízí hotové řešení s vestavěným LCD displejem, ovládacími tlačítky a správou napájení, což eliminuje potřebu návrhu vlastních mechanických krytů a doplňkových obvodů.</w:t>
+      </w:r>
+    </w:p>
+    <w:p>
+      <w:r>
+        <w:t>Klíčovou vlastností je vysoká modularita založená na stohování modulů přes sběrnici M-Bus. Tímto způsobem lze systém snadno rozšířit o specifické funkce, jako jsou reléové výstupy, senzory prostředí nebo různé komunikační protokoly (</w:t>
+      </w:r>
+      <w:proofErr w:type="spellStart"/>
+      <w:r>
+        <w:t>LoRa</w:t>
+      </w:r>
+      <w:proofErr w:type="spellEnd"/>
+      <w:r>
+        <w:t>, RS485), bez nutnosti pájení.</w:t>
+      </w:r>
+    </w:p>
+    <w:p>
+      <w:r>
+        <w:t xml:space="preserve">V architektuře chytrého domu plní M5Stack roli tzv. </w:t>
+      </w:r>
+      <w:proofErr w:type="spellStart"/>
+      <w:r>
+        <w:t>edge</w:t>
+      </w:r>
+      <w:proofErr w:type="spellEnd"/>
+      <w:r>
+        <w:t xml:space="preserve"> </w:t>
+      </w:r>
+      <w:proofErr w:type="spellStart"/>
+      <w:r>
+        <w:t>device</w:t>
+      </w:r>
+      <w:proofErr w:type="spellEnd"/>
+      <w:r>
+        <w:t xml:space="preserve"> (koncového zařízení). Slouží jako inteligentní uzel, který zajišťuje lokální sběr dat, jejich předběžné zpracování a následnou komunikaci s centrálním serverem (v tomto případě </w:t>
+      </w:r>
+      <w:proofErr w:type="spellStart"/>
+      <w:r>
+        <w:t>Radxa</w:t>
+      </w:r>
+      <w:proofErr w:type="spellEnd"/>
+      <w:r>
+        <w:t xml:space="preserve">). Tato platforma je v rámci </w:t>
+      </w:r>
+      <w:proofErr w:type="spellStart"/>
+      <w:r>
+        <w:t>IoT</w:t>
+      </w:r>
+      <w:proofErr w:type="spellEnd"/>
+      <w:r>
+        <w:t xml:space="preserve"> projektů referenčním příkladem metodiky Rapid </w:t>
+      </w:r>
+      <w:proofErr w:type="spellStart"/>
+      <w:r>
+        <w:t>Prototyping</w:t>
+      </w:r>
+      <w:proofErr w:type="spellEnd"/>
+      <w:r>
+        <w:t>, která výrazně zkracuje přechod od návrhu k nasazení funkčního zařízení v interiéru.</w:t>
+      </w:r>
+    </w:p>
+    <w:p/>
+    <w:p/>
+    <w:p>
+      <w:pPr>
+        <w:pStyle w:val="Nadpis2"/>
+      </w:pPr>
+      <w:bookmarkStart w:id="10" w:name="_Toc225844746"/>
       <w:r>
         <w:lastRenderedPageBreak/>
-        <w:t xml:space="preserve">1.4 Smart </w:t>
+        <w:t>1.</w:t>
+      </w:r>
+      <w:r>
+        <w:t>x</w:t>
+      </w:r>
+      <w:r>
+        <w:t xml:space="preserve"> Smart </w:t>
       </w:r>
       <w:proofErr w:type="spellStart"/>
       <w:r>
         <w:t>Home</w:t>
       </w:r>
+      <w:bookmarkEnd w:id="10"/>
       <w:proofErr w:type="spellEnd"/>
     </w:p>
     <w:p>
@@ -16030,18 +17254,26 @@
         <w:t xml:space="preserve">. Mezi běžné prvky patří například chytré osvětlení, termostaty, bezpečnostní kamery, senzory pohybu, chytré zámky či domácí spotřebiče. Tato zařízení spolu komunikují prostřednictvím internetu </w:t>
       </w:r>
       <w:r>
-        <w:t>a dalších jiných bezdrátových technologií</w:t>
-      </w:r>
-      <w:r>
-        <w:t xml:space="preserve">(tzv. Internet </w:t>
-      </w:r>
-      <w:proofErr w:type="spellStart"/>
-      <w:r>
-        <w:t>of</w:t>
-      </w:r>
-      <w:proofErr w:type="spellEnd"/>
-      <w:r>
-        <w:t xml:space="preserve"> </w:t>
+        <w:t xml:space="preserve">a dalších jiných bezdrátových </w:t>
+      </w:r>
+      <w:proofErr w:type="gramStart"/>
+      <w:r>
+        <w:t>technologií</w:t>
+      </w:r>
+      <w:r>
+        <w:t>(</w:t>
+      </w:r>
+      <w:proofErr w:type="gramEnd"/>
+      <w:r>
+        <w:t xml:space="preserve">tzv. </w:t>
+      </w:r>
+      <w:proofErr w:type="gramStart"/>
+      <w:r>
+        <w:t>Internet</w:t>
+      </w:r>
+      <w:proofErr w:type="gramEnd"/>
+      <w:r>
+        <w:t xml:space="preserve"> of </w:t>
       </w:r>
       <w:proofErr w:type="spellStart"/>
       <w:r>
@@ -16081,8 +17313,11 @@
         <w:pStyle w:val="Nadpis3"/>
         <w:spacing w:after="0"/>
         <w:ind w:left="-5"/>
+        <w:rPr>
+          <w:lang w:val="en-US"/>
+        </w:rPr>
       </w:pPr>
-      <w:bookmarkStart w:id="4" w:name="_Toc213609424"/>
+      <w:bookmarkStart w:id="11" w:name="_Toc225844747"/>
       <w:r>
         <w:t>1.1</w:t>
       </w:r>
@@ -16095,7 +17330,7 @@
       <w:r>
         <w:t>Obrázky</w:t>
       </w:r>
-      <w:bookmarkEnd w:id="4"/>
+      <w:bookmarkEnd w:id="11"/>
       <w:r>
         <w:t xml:space="preserve"> </w:t>
       </w:r>
@@ -20132,10 +21367,100 @@
     </w:p>
     <w:p>
       <w:pPr>
+        <w:keepNext/>
+        <w:spacing w:after="388"/>
+        <w:ind w:left="3013"/>
+      </w:pPr>
+      <w:r>
+        <w:rPr>
+          <w:noProof/>
+        </w:rPr>
+        <w:drawing>
+          <wp:inline distT="0" distB="0" distL="0" distR="0" wp14:anchorId="0CA1D73B" wp14:editId="3ED71B07">
+            <wp:extent cx="2895600" cy="1571625"/>
+            <wp:effectExtent l="0" t="0" r="0" b="9525"/>
+            <wp:docPr id="150919756" name="Obrázek 267"/>
+            <wp:cNvGraphicFramePr>
+              <a:graphicFrameLocks xmlns:a="http://schemas.openxmlformats.org/drawingml/2006/main" noChangeAspect="1"/>
+            </wp:cNvGraphicFramePr>
+            <a:graphic xmlns:a="http://schemas.openxmlformats.org/drawingml/2006/main">
+              <a:graphicData uri="http://schemas.openxmlformats.org/drawingml/2006/picture">
+                <pic:pic xmlns:pic="http://schemas.openxmlformats.org/drawingml/2006/picture">
+                  <pic:nvPicPr>
+                    <pic:cNvPr id="0" name="Picture 5"/>
+                    <pic:cNvPicPr>
+                      <a:picLocks noChangeAspect="1" noChangeArrowheads="1"/>
+                    </pic:cNvPicPr>
+                  </pic:nvPicPr>
+                  <pic:blipFill>
+                    <a:blip r:embed="rId13">
+                      <a:extLst>
+                        <a:ext uri="{28A0092B-C50C-407E-A947-70E740481C1C}">
+                          <a14:useLocalDpi xmlns:a14="http://schemas.microsoft.com/office/drawing/2010/main" val="0"/>
+                        </a:ext>
+                      </a:extLst>
+                    </a:blip>
+                    <a:srcRect/>
+                    <a:stretch>
+                      <a:fillRect/>
+                    </a:stretch>
+                  </pic:blipFill>
+                  <pic:spPr bwMode="auto">
+                    <a:xfrm>
+                      <a:off x="0" y="0"/>
+                      <a:ext cx="2895600" cy="1571625"/>
+                    </a:xfrm>
+                    <a:prstGeom prst="rect">
+                      <a:avLst/>
+                    </a:prstGeom>
+                    <a:noFill/>
+                    <a:ln>
+                      <a:noFill/>
+                    </a:ln>
+                  </pic:spPr>
+                </pic:pic>
+              </a:graphicData>
+            </a:graphic>
+          </wp:inline>
+        </w:drawing>
+      </w:r>
+    </w:p>
+    <w:p>
+      <w:pPr>
+        <w:pStyle w:val="Titulek"/>
+        <w:rPr>
+          <w:b/>
+          <w:bCs/>
+        </w:rPr>
+      </w:pPr>
+      <w:r>
+        <w:t xml:space="preserve">Schéma HTTP protokolu </w:t>
+      </w:r>
+      <w:r>
+        <w:fldChar w:fldCharType="begin"/>
+      </w:r>
+      <w:r>
+        <w:instrText xml:space="preserve"> SEQ Schéma_HTTP_protokolu \* ARABIC </w:instrText>
+      </w:r>
+      <w:r>
+        <w:fldChar w:fldCharType="separate"/>
+      </w:r>
+      <w:r>
+        <w:rPr>
+          <w:noProof/>
+        </w:rPr>
+        <w:t>2</w:t>
+      </w:r>
+      <w:r>
+        <w:fldChar w:fldCharType="end"/>
+      </w:r>
+    </w:p>
+    <w:p>
+      <w:pPr>
         <w:pStyle w:val="Nadpis3"/>
         <w:ind w:left="-5"/>
       </w:pPr>
-      <w:bookmarkStart w:id="5" w:name="_Toc213609425"/>
+      <w:bookmarkStart w:id="12" w:name="_Toc225844748"/>
       <w:r>
         <w:t>1.2</w:t>
       </w:r>
@@ -20148,7 +21473,7 @@
       <w:r>
         <w:t>Tabulky</w:t>
       </w:r>
-      <w:bookmarkEnd w:id="5"/>
+      <w:bookmarkEnd w:id="12"/>
       <w:r>
         <w:t xml:space="preserve"> </w:t>
       </w:r>
@@ -20327,7 +21652,7 @@
         <w:spacing w:after="0"/>
         <w:ind w:left="-5"/>
       </w:pPr>
-      <w:bookmarkStart w:id="6" w:name="_Toc213609426"/>
+      <w:bookmarkStart w:id="13" w:name="_Toc225844749"/>
       <w:r>
         <w:lastRenderedPageBreak/>
         <w:t>1.3</w:t>
@@ -20341,7 +21666,7 @@
       <w:r>
         <w:t>Grafy</w:t>
       </w:r>
-      <w:bookmarkEnd w:id="6"/>
+      <w:bookmarkEnd w:id="13"/>
       <w:r>
         <w:t xml:space="preserve"> </w:t>
       </w:r>
@@ -24955,7 +26280,7 @@
         <w:spacing w:after="120"/>
         <w:ind w:left="-5"/>
       </w:pPr>
-      <w:bookmarkStart w:id="7" w:name="_Toc213609427"/>
+      <w:bookmarkStart w:id="14" w:name="_Toc225844750"/>
       <w:r>
         <w:t>1.4</w:t>
       </w:r>
@@ -24968,7 +26293,7 @@
       <w:r>
         <w:t>Zdrojové kódy</w:t>
       </w:r>
-      <w:bookmarkEnd w:id="7"/>
+      <w:bookmarkEnd w:id="14"/>
       <w:r>
         <w:t xml:space="preserve"> </w:t>
       </w:r>
@@ -25085,6 +26410,7 @@
         <w:t xml:space="preserve"> = </w:t>
       </w:r>
       <w:proofErr w:type="spellStart"/>
+      <w:proofErr w:type="gramStart"/>
       <w:r>
         <w:rPr>
           <w:rFonts w:ascii="Consolas" w:eastAsia="Consolas" w:hAnsi="Consolas" w:cs="Consolas"/>
@@ -25101,6 +26427,7 @@
         </w:rPr>
         <w:t>(</w:t>
       </w:r>
+      <w:proofErr w:type="gramEnd"/>
       <w:r>
         <w:rPr>
           <w:rFonts w:ascii="Consolas" w:eastAsia="Consolas" w:hAnsi="Consolas" w:cs="Consolas"/>
@@ -25119,6 +26446,7 @@
         <w:t>Scripting.FileSystemObject</w:t>
       </w:r>
       <w:proofErr w:type="spellEnd"/>
+      <w:proofErr w:type="gramStart"/>
       <w:r>
         <w:rPr>
           <w:rFonts w:ascii="Consolas" w:eastAsia="Consolas" w:hAnsi="Consolas" w:cs="Consolas"/>
@@ -25132,7 +26460,15 @@
           <w:rFonts w:ascii="Consolas" w:eastAsia="Consolas" w:hAnsi="Consolas" w:cs="Consolas"/>
           <w:sz w:val="20"/>
         </w:rPr>
-        <w:t xml:space="preserve">)     </w:t>
+        <w:t xml:space="preserve">)   </w:t>
+      </w:r>
+      <w:proofErr w:type="gramEnd"/>
+      <w:r>
+        <w:rPr>
+          <w:rFonts w:ascii="Consolas" w:eastAsia="Consolas" w:hAnsi="Consolas" w:cs="Consolas"/>
+          <w:sz w:val="20"/>
+        </w:rPr>
+        <w:t xml:space="preserve">  </w:t>
       </w:r>
       <w:r>
         <w:rPr>
@@ -25166,6 +26502,7 @@
         <w:t xml:space="preserve"> = </w:t>
       </w:r>
       <w:proofErr w:type="spellStart"/>
+      <w:proofErr w:type="gramStart"/>
       <w:r>
         <w:rPr>
           <w:rFonts w:ascii="Consolas" w:eastAsia="Consolas" w:hAnsi="Consolas" w:cs="Consolas"/>
@@ -25174,6 +26511,7 @@
         <w:t>fso.OpenTextFile</w:t>
       </w:r>
       <w:proofErr w:type="spellEnd"/>
+      <w:proofErr w:type="gramEnd"/>
       <w:r>
         <w:rPr>
           <w:rFonts w:ascii="Consolas" w:eastAsia="Consolas" w:hAnsi="Consolas" w:cs="Consolas"/>
@@ -25373,6 +26711,7 @@
         <w:t xml:space="preserve"> = </w:t>
       </w:r>
       <w:proofErr w:type="spellStart"/>
+      <w:proofErr w:type="gramStart"/>
       <w:r>
         <w:rPr>
           <w:rFonts w:ascii="Consolas" w:eastAsia="Consolas" w:hAnsi="Consolas" w:cs="Consolas"/>
@@ -25405,6 +26744,7 @@
         <w:t>(</w:t>
       </w:r>
       <w:proofErr w:type="spellStart"/>
+      <w:proofErr w:type="gramEnd"/>
       <w:r>
         <w:rPr>
           <w:rFonts w:ascii="Consolas" w:eastAsia="Consolas" w:hAnsi="Consolas" w:cs="Consolas"/>
@@ -25426,63 +26766,98 @@
           <w:color w:val="A31515"/>
           <w:sz w:val="20"/>
         </w:rPr>
-        <w:t>"TO"</w:t>
-      </w:r>
-      <w:r>
-        <w:rPr>
-          <w:rFonts w:ascii="Consolas" w:eastAsia="Consolas" w:hAnsi="Consolas" w:cs="Consolas"/>
-          <w:sz w:val="20"/>
-        </w:rPr>
-        <w:t xml:space="preserve">)(1), </w:t>
-      </w:r>
-      <w:proofErr w:type="spellStart"/>
-      <w:r>
-        <w:rPr>
-          <w:rFonts w:ascii="Consolas" w:eastAsia="Consolas" w:hAnsi="Consolas" w:cs="Consolas"/>
-          <w:sz w:val="20"/>
-        </w:rPr>
-        <w:t>vbLf</w:t>
-      </w:r>
-      <w:proofErr w:type="spellEnd"/>
-      <w:r>
-        <w:rPr>
-          <w:rFonts w:ascii="Consolas" w:eastAsia="Consolas" w:hAnsi="Consolas" w:cs="Consolas"/>
-          <w:sz w:val="20"/>
-        </w:rPr>
-        <w:t xml:space="preserve">, </w:t>
-      </w:r>
+        <w:t>"TO</w:t>
+      </w:r>
+      <w:proofErr w:type="gramStart"/>
       <w:r>
         <w:rPr>
           <w:rFonts w:ascii="Consolas" w:eastAsia="Consolas" w:hAnsi="Consolas" w:cs="Consolas"/>
           <w:color w:val="A31515"/>
           <w:sz w:val="20"/>
         </w:rPr>
-        <w:t>""</w:t>
+        <w:t>"</w:t>
       </w:r>
       <w:r>
         <w:rPr>
           <w:rFonts w:ascii="Consolas" w:eastAsia="Consolas" w:hAnsi="Consolas" w:cs="Consolas"/>
           <w:sz w:val="20"/>
         </w:rPr>
-        <w:t xml:space="preserve">)     </w:t>
-      </w:r>
-      <w:proofErr w:type="spellStart"/>
+        <w:t>)(</w:t>
+      </w:r>
+      <w:proofErr w:type="gramEnd"/>
       <w:r>
         <w:rPr>
           <w:rFonts w:ascii="Consolas" w:eastAsia="Consolas" w:hAnsi="Consolas" w:cs="Consolas"/>
           <w:sz w:val="20"/>
         </w:rPr>
-        <w:t>strCC</w:t>
-      </w:r>
-      <w:proofErr w:type="spellEnd"/>
+        <w:t xml:space="preserve">1), </w:t>
+      </w:r>
+      <w:proofErr w:type="spellStart"/>
       <w:r>
         <w:rPr>
           <w:rFonts w:ascii="Consolas" w:eastAsia="Consolas" w:hAnsi="Consolas" w:cs="Consolas"/>
           <w:sz w:val="20"/>
         </w:rPr>
+        <w:t>vbLf</w:t>
+      </w:r>
+      <w:proofErr w:type="spellEnd"/>
+      <w:r>
+        <w:rPr>
+          <w:rFonts w:ascii="Consolas" w:eastAsia="Consolas" w:hAnsi="Consolas" w:cs="Consolas"/>
+          <w:sz w:val="20"/>
+        </w:rPr>
+        <w:t xml:space="preserve">, </w:t>
+      </w:r>
+      <w:r>
+        <w:rPr>
+          <w:rFonts w:ascii="Consolas" w:eastAsia="Consolas" w:hAnsi="Consolas" w:cs="Consolas"/>
+          <w:color w:val="A31515"/>
+          <w:sz w:val="20"/>
+        </w:rPr>
+        <w:t>"</w:t>
+      </w:r>
+      <w:proofErr w:type="gramStart"/>
+      <w:r>
+        <w:rPr>
+          <w:rFonts w:ascii="Consolas" w:eastAsia="Consolas" w:hAnsi="Consolas" w:cs="Consolas"/>
+          <w:color w:val="A31515"/>
+          <w:sz w:val="20"/>
+        </w:rPr>
+        <w:t>"</w:t>
+      </w:r>
+      <w:r>
+        <w:rPr>
+          <w:rFonts w:ascii="Consolas" w:eastAsia="Consolas" w:hAnsi="Consolas" w:cs="Consolas"/>
+          <w:sz w:val="20"/>
+        </w:rPr>
+        <w:t xml:space="preserve">)   </w:t>
+      </w:r>
+      <w:proofErr w:type="gramEnd"/>
+      <w:r>
+        <w:rPr>
+          <w:rFonts w:ascii="Consolas" w:eastAsia="Consolas" w:hAnsi="Consolas" w:cs="Consolas"/>
+          <w:sz w:val="20"/>
+        </w:rPr>
+        <w:t xml:space="preserve">  </w:t>
+      </w:r>
+      <w:proofErr w:type="spellStart"/>
+      <w:r>
+        <w:rPr>
+          <w:rFonts w:ascii="Consolas" w:eastAsia="Consolas" w:hAnsi="Consolas" w:cs="Consolas"/>
+          <w:sz w:val="20"/>
+        </w:rPr>
+        <w:t>strCC</w:t>
+      </w:r>
+      <w:proofErr w:type="spellEnd"/>
+      <w:r>
+        <w:rPr>
+          <w:rFonts w:ascii="Consolas" w:eastAsia="Consolas" w:hAnsi="Consolas" w:cs="Consolas"/>
+          <w:sz w:val="20"/>
+        </w:rPr>
         <w:t xml:space="preserve"> = </w:t>
       </w:r>
       <w:proofErr w:type="spellStart"/>
+      <w:proofErr w:type="gramStart"/>
       <w:r>
         <w:rPr>
           <w:rFonts w:ascii="Consolas" w:eastAsia="Consolas" w:hAnsi="Consolas" w:cs="Consolas"/>
@@ -25515,6 +26890,7 @@
         <w:t>(</w:t>
       </w:r>
       <w:proofErr w:type="spellStart"/>
+      <w:proofErr w:type="gramEnd"/>
       <w:r>
         <w:rPr>
           <w:rFonts w:ascii="Consolas" w:eastAsia="Consolas" w:hAnsi="Consolas" w:cs="Consolas"/>
@@ -25536,63 +26912,98 @@
           <w:color w:val="A31515"/>
           <w:sz w:val="20"/>
         </w:rPr>
-        <w:t>"CC"</w:t>
-      </w:r>
-      <w:r>
-        <w:rPr>
-          <w:rFonts w:ascii="Consolas" w:eastAsia="Consolas" w:hAnsi="Consolas" w:cs="Consolas"/>
-          <w:sz w:val="20"/>
-        </w:rPr>
-        <w:t xml:space="preserve">)(1), </w:t>
-      </w:r>
-      <w:proofErr w:type="spellStart"/>
-      <w:r>
-        <w:rPr>
-          <w:rFonts w:ascii="Consolas" w:eastAsia="Consolas" w:hAnsi="Consolas" w:cs="Consolas"/>
-          <w:sz w:val="20"/>
-        </w:rPr>
-        <w:t>vbLf</w:t>
-      </w:r>
-      <w:proofErr w:type="spellEnd"/>
-      <w:r>
-        <w:rPr>
-          <w:rFonts w:ascii="Consolas" w:eastAsia="Consolas" w:hAnsi="Consolas" w:cs="Consolas"/>
-          <w:sz w:val="20"/>
-        </w:rPr>
-        <w:t xml:space="preserve">, </w:t>
-      </w:r>
+        <w:t>"CC</w:t>
+      </w:r>
+      <w:proofErr w:type="gramStart"/>
       <w:r>
         <w:rPr>
           <w:rFonts w:ascii="Consolas" w:eastAsia="Consolas" w:hAnsi="Consolas" w:cs="Consolas"/>
           <w:color w:val="A31515"/>
           <w:sz w:val="20"/>
         </w:rPr>
-        <w:t>""</w:t>
+        <w:t>"</w:t>
       </w:r>
       <w:r>
         <w:rPr>
           <w:rFonts w:ascii="Consolas" w:eastAsia="Consolas" w:hAnsi="Consolas" w:cs="Consolas"/>
           <w:sz w:val="20"/>
         </w:rPr>
-        <w:t xml:space="preserve">)     </w:t>
-      </w:r>
-      <w:proofErr w:type="spellStart"/>
+        <w:t>)(</w:t>
+      </w:r>
+      <w:proofErr w:type="gramEnd"/>
       <w:r>
         <w:rPr>
           <w:rFonts w:ascii="Consolas" w:eastAsia="Consolas" w:hAnsi="Consolas" w:cs="Consolas"/>
           <w:sz w:val="20"/>
         </w:rPr>
-        <w:t>strBCC</w:t>
-      </w:r>
-      <w:proofErr w:type="spellEnd"/>
+        <w:t xml:space="preserve">1), </w:t>
+      </w:r>
+      <w:proofErr w:type="spellStart"/>
       <w:r>
         <w:rPr>
           <w:rFonts w:ascii="Consolas" w:eastAsia="Consolas" w:hAnsi="Consolas" w:cs="Consolas"/>
           <w:sz w:val="20"/>
         </w:rPr>
+        <w:t>vbLf</w:t>
+      </w:r>
+      <w:proofErr w:type="spellEnd"/>
+      <w:r>
+        <w:rPr>
+          <w:rFonts w:ascii="Consolas" w:eastAsia="Consolas" w:hAnsi="Consolas" w:cs="Consolas"/>
+          <w:sz w:val="20"/>
+        </w:rPr>
+        <w:t xml:space="preserve">, </w:t>
+      </w:r>
+      <w:r>
+        <w:rPr>
+          <w:rFonts w:ascii="Consolas" w:eastAsia="Consolas" w:hAnsi="Consolas" w:cs="Consolas"/>
+          <w:color w:val="A31515"/>
+          <w:sz w:val="20"/>
+        </w:rPr>
+        <w:t>"</w:t>
+      </w:r>
+      <w:proofErr w:type="gramStart"/>
+      <w:r>
+        <w:rPr>
+          <w:rFonts w:ascii="Consolas" w:eastAsia="Consolas" w:hAnsi="Consolas" w:cs="Consolas"/>
+          <w:color w:val="A31515"/>
+          <w:sz w:val="20"/>
+        </w:rPr>
+        <w:t>"</w:t>
+      </w:r>
+      <w:r>
+        <w:rPr>
+          <w:rFonts w:ascii="Consolas" w:eastAsia="Consolas" w:hAnsi="Consolas" w:cs="Consolas"/>
+          <w:sz w:val="20"/>
+        </w:rPr>
+        <w:t xml:space="preserve">)   </w:t>
+      </w:r>
+      <w:proofErr w:type="gramEnd"/>
+      <w:r>
+        <w:rPr>
+          <w:rFonts w:ascii="Consolas" w:eastAsia="Consolas" w:hAnsi="Consolas" w:cs="Consolas"/>
+          <w:sz w:val="20"/>
+        </w:rPr>
+        <w:t xml:space="preserve">  </w:t>
+      </w:r>
+      <w:proofErr w:type="spellStart"/>
+      <w:r>
+        <w:rPr>
+          <w:rFonts w:ascii="Consolas" w:eastAsia="Consolas" w:hAnsi="Consolas" w:cs="Consolas"/>
+          <w:sz w:val="20"/>
+        </w:rPr>
+        <w:t>strBCC</w:t>
+      </w:r>
+      <w:proofErr w:type="spellEnd"/>
+      <w:r>
+        <w:rPr>
+          <w:rFonts w:ascii="Consolas" w:eastAsia="Consolas" w:hAnsi="Consolas" w:cs="Consolas"/>
+          <w:sz w:val="20"/>
+        </w:rPr>
         <w:t xml:space="preserve"> = </w:t>
       </w:r>
       <w:proofErr w:type="spellStart"/>
+      <w:proofErr w:type="gramStart"/>
       <w:r>
         <w:rPr>
           <w:rFonts w:ascii="Consolas" w:eastAsia="Consolas" w:hAnsi="Consolas" w:cs="Consolas"/>
@@ -25625,6 +27036,7 @@
         <w:t>(</w:t>
       </w:r>
       <w:proofErr w:type="spellStart"/>
+      <w:proofErr w:type="gramEnd"/>
       <w:r>
         <w:rPr>
           <w:rFonts w:ascii="Consolas" w:eastAsia="Consolas" w:hAnsi="Consolas" w:cs="Consolas"/>
@@ -25646,14 +27058,31 @@
           <w:color w:val="A31515"/>
           <w:sz w:val="20"/>
         </w:rPr>
-        <w:t>"BCC"</w:t>
+        <w:t>"BCC</w:t>
+      </w:r>
+      <w:proofErr w:type="gramStart"/>
+      <w:r>
+        <w:rPr>
+          <w:rFonts w:ascii="Consolas" w:eastAsia="Consolas" w:hAnsi="Consolas" w:cs="Consolas"/>
+          <w:color w:val="A31515"/>
+          <w:sz w:val="20"/>
+        </w:rPr>
+        <w:t>"</w:t>
       </w:r>
       <w:r>
         <w:rPr>
           <w:rFonts w:ascii="Consolas" w:eastAsia="Consolas" w:hAnsi="Consolas" w:cs="Consolas"/>
           <w:sz w:val="20"/>
         </w:rPr>
-        <w:t xml:space="preserve">)(1), </w:t>
+        <w:t>)(</w:t>
+      </w:r>
+      <w:proofErr w:type="gramEnd"/>
+      <w:r>
+        <w:rPr>
+          <w:rFonts w:ascii="Consolas" w:eastAsia="Consolas" w:hAnsi="Consolas" w:cs="Consolas"/>
+          <w:sz w:val="20"/>
+        </w:rPr>
+        <w:t xml:space="preserve">1), </w:t>
       </w:r>
       <w:proofErr w:type="spellStart"/>
       <w:r>
@@ -25719,7 +27148,7 @@
         <w:pStyle w:val="Nadpis3"/>
         <w:ind w:left="-5"/>
       </w:pPr>
-      <w:bookmarkStart w:id="8" w:name="_Toc213609428"/>
+      <w:bookmarkStart w:id="15" w:name="_Toc225844751"/>
       <w:r>
         <w:t>1.5</w:t>
       </w:r>
@@ -25732,7 +27161,7 @@
       <w:r>
         <w:t>Citace</w:t>
       </w:r>
-      <w:bookmarkEnd w:id="8"/>
+      <w:bookmarkEnd w:id="15"/>
       <w:r>
         <w:t xml:space="preserve"> </w:t>
       </w:r>
@@ -25756,7 +27185,7 @@
         <w:spacing w:after="254"/>
         <w:ind w:left="-5"/>
       </w:pPr>
-      <w:bookmarkStart w:id="9" w:name="_Toc213609429"/>
+      <w:bookmarkStart w:id="16" w:name="_Toc225844752"/>
       <w:r>
         <w:t>1.6</w:t>
       </w:r>
@@ -25769,7 +27198,7 @@
       <w:r>
         <w:t>Rovnice</w:t>
       </w:r>
-      <w:bookmarkEnd w:id="9"/>
+      <w:bookmarkEnd w:id="16"/>
       <w:r>
         <w:t xml:space="preserve"> </w:t>
       </w:r>
@@ -25827,17 +27256,17 @@
       <w:pPr>
         <w:pStyle w:val="Nadpis3"/>
       </w:pPr>
-      <w:bookmarkStart w:id="10" w:name="_Toc213609430"/>
+      <w:bookmarkStart w:id="17" w:name="_Toc225844753"/>
       <w:r>
         <w:t>1.7 Pokus</w:t>
       </w:r>
-      <w:bookmarkEnd w:id="10"/>
+      <w:bookmarkEnd w:id="17"/>
     </w:p>
     <w:p>
       <w:pPr>
         <w:pStyle w:val="Nadpis3"/>
       </w:pPr>
-      <w:bookmarkStart w:id="11" w:name="_Toc213609431"/>
+      <w:bookmarkStart w:id="18" w:name="_Toc225844754"/>
       <w:r>
         <w:t xml:space="preserve">1.8 </w:t>
       </w:r>
@@ -25845,7 +27274,7 @@
       <w:r>
         <w:t>Nevim</w:t>
       </w:r>
-      <w:bookmarkEnd w:id="11"/>
+      <w:bookmarkEnd w:id="18"/>
       <w:proofErr w:type="spellEnd"/>
     </w:p>
     <w:p/>
@@ -25875,11 +27304,11 @@
         <w:pStyle w:val="Nadpis1"/>
         <w:ind w:left="-5"/>
       </w:pPr>
-      <w:bookmarkStart w:id="12" w:name="_Toc213609432"/>
+      <w:bookmarkStart w:id="19" w:name="_Toc225844755"/>
       <w:r>
         <w:t>Praktická část</w:t>
       </w:r>
-      <w:bookmarkEnd w:id="12"/>
+      <w:bookmarkEnd w:id="19"/>
       <w:r>
         <w:t xml:space="preserve"> </w:t>
       </w:r>
@@ -25925,12 +27354,12 @@
         <w:pStyle w:val="Nadpis1"/>
         <w:ind w:left="-5"/>
       </w:pPr>
-      <w:bookmarkStart w:id="13" w:name="_Toc213609433"/>
+      <w:bookmarkStart w:id="20" w:name="_Toc225844756"/>
       <w:r>
         <w:lastRenderedPageBreak/>
         <w:t>Závěr</w:t>
       </w:r>
-      <w:bookmarkEnd w:id="13"/>
+      <w:bookmarkEnd w:id="20"/>
       <w:r>
         <w:t xml:space="preserve"> </w:t>
       </w:r>
@@ -25976,12 +27405,12 @@
         <w:pStyle w:val="Nadpis1"/>
         <w:ind w:left="-5"/>
       </w:pPr>
-      <w:bookmarkStart w:id="14" w:name="_Toc213609434"/>
+      <w:bookmarkStart w:id="21" w:name="_Toc225844757"/>
       <w:r>
         <w:lastRenderedPageBreak/>
         <w:t>Použitá literatura</w:t>
       </w:r>
-      <w:bookmarkEnd w:id="14"/>
+      <w:bookmarkEnd w:id="21"/>
       <w:r>
         <w:t xml:space="preserve"> </w:t>
       </w:r>
@@ -26047,12 +27476,12 @@
         <w:spacing w:after="321"/>
         <w:ind w:left="-5"/>
       </w:pPr>
-      <w:bookmarkStart w:id="15" w:name="_Toc213609435"/>
+      <w:bookmarkStart w:id="22" w:name="_Toc225844758"/>
       <w:r>
         <w:lastRenderedPageBreak/>
         <w:t>Přílohy</w:t>
       </w:r>
-      <w:bookmarkEnd w:id="15"/>
+      <w:bookmarkEnd w:id="22"/>
       <w:r>
         <w:rPr>
           <w:b w:val="0"/>
@@ -26066,7 +27495,7 @@
         <w:spacing w:after="281"/>
         <w:ind w:left="-5"/>
       </w:pPr>
-      <w:bookmarkStart w:id="16" w:name="_Toc213609436"/>
+      <w:bookmarkStart w:id="23" w:name="_Toc225844759"/>
       <w:r>
         <w:t>A</w:t>
       </w:r>
@@ -26079,7 +27508,7 @@
       <w:r>
         <w:t>Příloha</w:t>
       </w:r>
-      <w:bookmarkEnd w:id="16"/>
+      <w:bookmarkEnd w:id="23"/>
       <w:r>
         <w:t xml:space="preserve"> </w:t>
       </w:r>
@@ -26102,9 +27531,9 @@
       </w:r>
     </w:p>
     <w:sectPr>
-      <w:footerReference w:type="even" r:id="rId11"/>
-      <w:footerReference w:type="default" r:id="rId12"/>
-      <w:footerReference w:type="first" r:id="rId13"/>
+      <w:footerReference w:type="even" r:id="rId14"/>
+      <w:footerReference w:type="default" r:id="rId15"/>
+      <w:footerReference w:type="first" r:id="rId16"/>
       <w:pgSz w:w="11906" w:h="16838"/>
       <w:pgMar w:top="1318" w:right="1436" w:bottom="1446" w:left="1419" w:header="708" w:footer="976" w:gutter="0"/>
       <w:cols w:space="708"/>
@@ -26423,6 +27852,304 @@
     </w:lvl>
   </w:abstractNum>
   <w:abstractNum w:abstractNumId="1" w15:restartNumberingAfterBreak="0">
+    <w:nsid w:val="08B9549C"/>
+    <w:multiLevelType w:val="multilevel"/>
+    <w:tmpl w:val="4418AFFC"/>
+    <w:lvl w:ilvl="0">
+      <w:start w:val="1"/>
+      <w:numFmt w:val="bullet"/>
+      <w:lvlText w:val=""/>
+      <w:lvlJc w:val="left"/>
+      <w:pPr>
+        <w:tabs>
+          <w:tab w:val="num" w:pos="720"/>
+        </w:tabs>
+        <w:ind w:left="720" w:hanging="360"/>
+      </w:pPr>
+      <w:rPr>
+        <w:rFonts w:ascii="Symbol" w:hAnsi="Symbol" w:hint="default"/>
+        <w:sz w:val="20"/>
+      </w:rPr>
+    </w:lvl>
+    <w:lvl w:ilvl="1" w:tentative="1">
+      <w:start w:val="1"/>
+      <w:numFmt w:val="bullet"/>
+      <w:lvlText w:val="o"/>
+      <w:lvlJc w:val="left"/>
+      <w:pPr>
+        <w:tabs>
+          <w:tab w:val="num" w:pos="1440"/>
+        </w:tabs>
+        <w:ind w:left="1440" w:hanging="360"/>
+      </w:pPr>
+      <w:rPr>
+        <w:rFonts w:ascii="Courier New" w:hAnsi="Courier New" w:hint="default"/>
+        <w:sz w:val="20"/>
+      </w:rPr>
+    </w:lvl>
+    <w:lvl w:ilvl="2" w:tentative="1">
+      <w:start w:val="1"/>
+      <w:numFmt w:val="bullet"/>
+      <w:lvlText w:val=""/>
+      <w:lvlJc w:val="left"/>
+      <w:pPr>
+        <w:tabs>
+          <w:tab w:val="num" w:pos="2160"/>
+        </w:tabs>
+        <w:ind w:left="2160" w:hanging="360"/>
+      </w:pPr>
+      <w:rPr>
+        <w:rFonts w:ascii="Wingdings" w:hAnsi="Wingdings" w:hint="default"/>
+        <w:sz w:val="20"/>
+      </w:rPr>
+    </w:lvl>
+    <w:lvl w:ilvl="3" w:tentative="1">
+      <w:start w:val="1"/>
+      <w:numFmt w:val="bullet"/>
+      <w:lvlText w:val=""/>
+      <w:lvlJc w:val="left"/>
+      <w:pPr>
+        <w:tabs>
+          <w:tab w:val="num" w:pos="2880"/>
+        </w:tabs>
+        <w:ind w:left="2880" w:hanging="360"/>
+      </w:pPr>
+      <w:rPr>
+        <w:rFonts w:ascii="Wingdings" w:hAnsi="Wingdings" w:hint="default"/>
+        <w:sz w:val="20"/>
+      </w:rPr>
+    </w:lvl>
+    <w:lvl w:ilvl="4" w:tentative="1">
+      <w:start w:val="1"/>
+      <w:numFmt w:val="bullet"/>
+      <w:lvlText w:val=""/>
+      <w:lvlJc w:val="left"/>
+      <w:pPr>
+        <w:tabs>
+          <w:tab w:val="num" w:pos="3600"/>
+        </w:tabs>
+        <w:ind w:left="3600" w:hanging="360"/>
+      </w:pPr>
+      <w:rPr>
+        <w:rFonts w:ascii="Wingdings" w:hAnsi="Wingdings" w:hint="default"/>
+        <w:sz w:val="20"/>
+      </w:rPr>
+    </w:lvl>
+    <w:lvl w:ilvl="5" w:tentative="1">
+      <w:start w:val="1"/>
+      <w:numFmt w:val="bullet"/>
+      <w:lvlText w:val=""/>
+      <w:lvlJc w:val="left"/>
+      <w:pPr>
+        <w:tabs>
+          <w:tab w:val="num" w:pos="4320"/>
+        </w:tabs>
+        <w:ind w:left="4320" w:hanging="360"/>
+      </w:pPr>
+      <w:rPr>
+        <w:rFonts w:ascii="Wingdings" w:hAnsi="Wingdings" w:hint="default"/>
+        <w:sz w:val="20"/>
+      </w:rPr>
+    </w:lvl>
+    <w:lvl w:ilvl="6" w:tentative="1">
+      <w:start w:val="1"/>
+      <w:numFmt w:val="bullet"/>
+      <w:lvlText w:val=""/>
+      <w:lvlJc w:val="left"/>
+      <w:pPr>
+        <w:tabs>
+          <w:tab w:val="num" w:pos="5040"/>
+        </w:tabs>
+        <w:ind w:left="5040" w:hanging="360"/>
+      </w:pPr>
+      <w:rPr>
+        <w:rFonts w:ascii="Wingdings" w:hAnsi="Wingdings" w:hint="default"/>
+        <w:sz w:val="20"/>
+      </w:rPr>
+    </w:lvl>
+    <w:lvl w:ilvl="7" w:tentative="1">
+      <w:start w:val="1"/>
+      <w:numFmt w:val="bullet"/>
+      <w:lvlText w:val=""/>
+      <w:lvlJc w:val="left"/>
+      <w:pPr>
+        <w:tabs>
+          <w:tab w:val="num" w:pos="5760"/>
+        </w:tabs>
+        <w:ind w:left="5760" w:hanging="360"/>
+      </w:pPr>
+      <w:rPr>
+        <w:rFonts w:ascii="Wingdings" w:hAnsi="Wingdings" w:hint="default"/>
+        <w:sz w:val="20"/>
+      </w:rPr>
+    </w:lvl>
+    <w:lvl w:ilvl="8" w:tentative="1">
+      <w:start w:val="1"/>
+      <w:numFmt w:val="bullet"/>
+      <w:lvlText w:val=""/>
+      <w:lvlJc w:val="left"/>
+      <w:pPr>
+        <w:tabs>
+          <w:tab w:val="num" w:pos="6480"/>
+        </w:tabs>
+        <w:ind w:left="6480" w:hanging="360"/>
+      </w:pPr>
+      <w:rPr>
+        <w:rFonts w:ascii="Wingdings" w:hAnsi="Wingdings" w:hint="default"/>
+        <w:sz w:val="20"/>
+      </w:rPr>
+    </w:lvl>
+  </w:abstractNum>
+  <w:abstractNum w:abstractNumId="2" w15:restartNumberingAfterBreak="0">
+    <w:nsid w:val="132B1D72"/>
+    <w:multiLevelType w:val="multilevel"/>
+    <w:tmpl w:val="A8FC7306"/>
+    <w:lvl w:ilvl="0">
+      <w:start w:val="1"/>
+      <w:numFmt w:val="bullet"/>
+      <w:lvlText w:val=""/>
+      <w:lvlJc w:val="left"/>
+      <w:pPr>
+        <w:tabs>
+          <w:tab w:val="num" w:pos="720"/>
+        </w:tabs>
+        <w:ind w:left="720" w:hanging="360"/>
+      </w:pPr>
+      <w:rPr>
+        <w:rFonts w:ascii="Symbol" w:hAnsi="Symbol" w:hint="default"/>
+        <w:sz w:val="20"/>
+      </w:rPr>
+    </w:lvl>
+    <w:lvl w:ilvl="1" w:tentative="1">
+      <w:start w:val="1"/>
+      <w:numFmt w:val="bullet"/>
+      <w:lvlText w:val="o"/>
+      <w:lvlJc w:val="left"/>
+      <w:pPr>
+        <w:tabs>
+          <w:tab w:val="num" w:pos="1440"/>
+        </w:tabs>
+        <w:ind w:left="1440" w:hanging="360"/>
+      </w:pPr>
+      <w:rPr>
+        <w:rFonts w:ascii="Courier New" w:hAnsi="Courier New" w:hint="default"/>
+        <w:sz w:val="20"/>
+      </w:rPr>
+    </w:lvl>
+    <w:lvl w:ilvl="2" w:tentative="1">
+      <w:start w:val="1"/>
+      <w:numFmt w:val="bullet"/>
+      <w:lvlText w:val=""/>
+      <w:lvlJc w:val="left"/>
+      <w:pPr>
+        <w:tabs>
+          <w:tab w:val="num" w:pos="2160"/>
+        </w:tabs>
+        <w:ind w:left="2160" w:hanging="360"/>
+      </w:pPr>
+      <w:rPr>
+        <w:rFonts w:ascii="Wingdings" w:hAnsi="Wingdings" w:hint="default"/>
+        <w:sz w:val="20"/>
+      </w:rPr>
+    </w:lvl>
+    <w:lvl w:ilvl="3" w:tentative="1">
+      <w:start w:val="1"/>
+      <w:numFmt w:val="bullet"/>
+      <w:lvlText w:val=""/>
+      <w:lvlJc w:val="left"/>
+      <w:pPr>
+        <w:tabs>
+          <w:tab w:val="num" w:pos="2880"/>
+        </w:tabs>
+        <w:ind w:left="2880" w:hanging="360"/>
+      </w:pPr>
+      <w:rPr>
+        <w:rFonts w:ascii="Wingdings" w:hAnsi="Wingdings" w:hint="default"/>
+        <w:sz w:val="20"/>
+      </w:rPr>
+    </w:lvl>
+    <w:lvl w:ilvl="4" w:tentative="1">
+      <w:start w:val="1"/>
+      <w:numFmt w:val="bullet"/>
+      <w:lvlText w:val=""/>
+      <w:lvlJc w:val="left"/>
+      <w:pPr>
+        <w:tabs>
+          <w:tab w:val="num" w:pos="3600"/>
+        </w:tabs>
+        <w:ind w:left="3600" w:hanging="360"/>
+      </w:pPr>
+      <w:rPr>
+        <w:rFonts w:ascii="Wingdings" w:hAnsi="Wingdings" w:hint="default"/>
+        <w:sz w:val="20"/>
+      </w:rPr>
+    </w:lvl>
+    <w:lvl w:ilvl="5" w:tentative="1">
+      <w:start w:val="1"/>
+      <w:numFmt w:val="bullet"/>
+      <w:lvlText w:val=""/>
+      <w:lvlJc w:val="left"/>
+      <w:pPr>
+        <w:tabs>
+          <w:tab w:val="num" w:pos="4320"/>
+        </w:tabs>
+        <w:ind w:left="4320" w:hanging="360"/>
+      </w:pPr>
+      <w:rPr>
+        <w:rFonts w:ascii="Wingdings" w:hAnsi="Wingdings" w:hint="default"/>
+        <w:sz w:val="20"/>
+      </w:rPr>
+    </w:lvl>
+    <w:lvl w:ilvl="6" w:tentative="1">
+      <w:start w:val="1"/>
+      <w:numFmt w:val="bullet"/>
+      <w:lvlText w:val=""/>
+      <w:lvlJc w:val="left"/>
+      <w:pPr>
+        <w:tabs>
+          <w:tab w:val="num" w:pos="5040"/>
+        </w:tabs>
+        <w:ind w:left="5040" w:hanging="360"/>
+      </w:pPr>
+      <w:rPr>
+        <w:rFonts w:ascii="Wingdings" w:hAnsi="Wingdings" w:hint="default"/>
+        <w:sz w:val="20"/>
+      </w:rPr>
+    </w:lvl>
+    <w:lvl w:ilvl="7" w:tentative="1">
+      <w:start w:val="1"/>
+      <w:numFmt w:val="bullet"/>
+      <w:lvlText w:val=""/>
+      <w:lvlJc w:val="left"/>
+      <w:pPr>
+        <w:tabs>
+          <w:tab w:val="num" w:pos="5760"/>
+        </w:tabs>
+        <w:ind w:left="5760" w:hanging="360"/>
+      </w:pPr>
+      <w:rPr>
+        <w:rFonts w:ascii="Wingdings" w:hAnsi="Wingdings" w:hint="default"/>
+        <w:sz w:val="20"/>
+      </w:rPr>
+    </w:lvl>
+    <w:lvl w:ilvl="8" w:tentative="1">
+      <w:start w:val="1"/>
+      <w:numFmt w:val="bullet"/>
+      <w:lvlText w:val=""/>
+      <w:lvlJc w:val="left"/>
+      <w:pPr>
+        <w:tabs>
+          <w:tab w:val="num" w:pos="6480"/>
+        </w:tabs>
+        <w:ind w:left="6480" w:hanging="360"/>
+      </w:pPr>
+      <w:rPr>
+        <w:rFonts w:ascii="Wingdings" w:hAnsi="Wingdings" w:hint="default"/>
+        <w:sz w:val="20"/>
+      </w:rPr>
+    </w:lvl>
+  </w:abstractNum>
+  <w:abstractNum w:abstractNumId="3" w15:restartNumberingAfterBreak="0">
     <w:nsid w:val="18716840"/>
     <w:multiLevelType w:val="hybridMultilevel"/>
     <w:tmpl w:val="769CDDB6"/>
@@ -26508,7 +28235,7 @@
       </w:pPr>
     </w:lvl>
   </w:abstractNum>
-  <w:abstractNum w:abstractNumId="2" w15:restartNumberingAfterBreak="0">
+  <w:abstractNum w:abstractNumId="4" w15:restartNumberingAfterBreak="0">
     <w:nsid w:val="5C917E2F"/>
     <w:multiLevelType w:val="multilevel"/>
     <w:tmpl w:val="67B4C33E"/>
@@ -26657,7 +28384,7 @@
       </w:rPr>
     </w:lvl>
   </w:abstractNum>
-  <w:abstractNum w:abstractNumId="3" w15:restartNumberingAfterBreak="0">
+  <w:abstractNum w:abstractNumId="5" w15:restartNumberingAfterBreak="0">
     <w:nsid w:val="62B17071"/>
     <w:multiLevelType w:val="hybridMultilevel"/>
     <w:tmpl w:val="D09C9C46"/>
@@ -26743,17 +28470,264 @@
       </w:pPr>
     </w:lvl>
   </w:abstractNum>
+  <w:abstractNum w:abstractNumId="6" w15:restartNumberingAfterBreak="0">
+    <w:nsid w:val="67BC6177"/>
+    <w:multiLevelType w:val="multilevel"/>
+    <w:tmpl w:val="AC98E4DC"/>
+    <w:lvl w:ilvl="0">
+      <w:start w:val="1"/>
+      <w:numFmt w:val="bullet"/>
+      <w:lvlText w:val=""/>
+      <w:lvlJc w:val="left"/>
+      <w:pPr>
+        <w:tabs>
+          <w:tab w:val="num" w:pos="720"/>
+        </w:tabs>
+        <w:ind w:left="720" w:hanging="360"/>
+      </w:pPr>
+      <w:rPr>
+        <w:rFonts w:ascii="Symbol" w:hAnsi="Symbol" w:hint="default"/>
+        <w:sz w:val="20"/>
+      </w:rPr>
+    </w:lvl>
+    <w:lvl w:ilvl="1" w:tentative="1">
+      <w:start w:val="1"/>
+      <w:numFmt w:val="bullet"/>
+      <w:lvlText w:val="o"/>
+      <w:lvlJc w:val="left"/>
+      <w:pPr>
+        <w:tabs>
+          <w:tab w:val="num" w:pos="1440"/>
+        </w:tabs>
+        <w:ind w:left="1440" w:hanging="360"/>
+      </w:pPr>
+      <w:rPr>
+        <w:rFonts w:ascii="Courier New" w:hAnsi="Courier New" w:hint="default"/>
+        <w:sz w:val="20"/>
+      </w:rPr>
+    </w:lvl>
+    <w:lvl w:ilvl="2" w:tentative="1">
+      <w:start w:val="1"/>
+      <w:numFmt w:val="bullet"/>
+      <w:lvlText w:val=""/>
+      <w:lvlJc w:val="left"/>
+      <w:pPr>
+        <w:tabs>
+          <w:tab w:val="num" w:pos="2160"/>
+        </w:tabs>
+        <w:ind w:left="2160" w:hanging="360"/>
+      </w:pPr>
+      <w:rPr>
+        <w:rFonts w:ascii="Wingdings" w:hAnsi="Wingdings" w:hint="default"/>
+        <w:sz w:val="20"/>
+      </w:rPr>
+    </w:lvl>
+    <w:lvl w:ilvl="3" w:tentative="1">
+      <w:start w:val="1"/>
+      <w:numFmt w:val="bullet"/>
+      <w:lvlText w:val=""/>
+      <w:lvlJc w:val="left"/>
+      <w:pPr>
+        <w:tabs>
+          <w:tab w:val="num" w:pos="2880"/>
+        </w:tabs>
+        <w:ind w:left="2880" w:hanging="360"/>
+      </w:pPr>
+      <w:rPr>
+        <w:rFonts w:ascii="Wingdings" w:hAnsi="Wingdings" w:hint="default"/>
+        <w:sz w:val="20"/>
+      </w:rPr>
+    </w:lvl>
+    <w:lvl w:ilvl="4" w:tentative="1">
+      <w:start w:val="1"/>
+      <w:numFmt w:val="bullet"/>
+      <w:lvlText w:val=""/>
+      <w:lvlJc w:val="left"/>
+      <w:pPr>
+        <w:tabs>
+          <w:tab w:val="num" w:pos="3600"/>
+        </w:tabs>
+        <w:ind w:left="3600" w:hanging="360"/>
+      </w:pPr>
+      <w:rPr>
+        <w:rFonts w:ascii="Wingdings" w:hAnsi="Wingdings" w:hint="default"/>
+        <w:sz w:val="20"/>
+      </w:rPr>
+    </w:lvl>
+    <w:lvl w:ilvl="5" w:tentative="1">
+      <w:start w:val="1"/>
+      <w:numFmt w:val="bullet"/>
+      <w:lvlText w:val=""/>
+      <w:lvlJc w:val="left"/>
+      <w:pPr>
+        <w:tabs>
+          <w:tab w:val="num" w:pos="4320"/>
+        </w:tabs>
+        <w:ind w:left="4320" w:hanging="360"/>
+      </w:pPr>
+      <w:rPr>
+        <w:rFonts w:ascii="Wingdings" w:hAnsi="Wingdings" w:hint="default"/>
+        <w:sz w:val="20"/>
+      </w:rPr>
+    </w:lvl>
+    <w:lvl w:ilvl="6" w:tentative="1">
+      <w:start w:val="1"/>
+      <w:numFmt w:val="bullet"/>
+      <w:lvlText w:val=""/>
+      <w:lvlJc w:val="left"/>
+      <w:pPr>
+        <w:tabs>
+          <w:tab w:val="num" w:pos="5040"/>
+        </w:tabs>
+        <w:ind w:left="5040" w:hanging="360"/>
+      </w:pPr>
+      <w:rPr>
+        <w:rFonts w:ascii="Wingdings" w:hAnsi="Wingdings" w:hint="default"/>
+        <w:sz w:val="20"/>
+      </w:rPr>
+    </w:lvl>
+    <w:lvl w:ilvl="7" w:tentative="1">
+      <w:start w:val="1"/>
+      <w:numFmt w:val="bullet"/>
+      <w:lvlText w:val=""/>
+      <w:lvlJc w:val="left"/>
+      <w:pPr>
+        <w:tabs>
+          <w:tab w:val="num" w:pos="5760"/>
+        </w:tabs>
+        <w:ind w:left="5760" w:hanging="360"/>
+      </w:pPr>
+      <w:rPr>
+        <w:rFonts w:ascii="Wingdings" w:hAnsi="Wingdings" w:hint="default"/>
+        <w:sz w:val="20"/>
+      </w:rPr>
+    </w:lvl>
+    <w:lvl w:ilvl="8" w:tentative="1">
+      <w:start w:val="1"/>
+      <w:numFmt w:val="bullet"/>
+      <w:lvlText w:val=""/>
+      <w:lvlJc w:val="left"/>
+      <w:pPr>
+        <w:tabs>
+          <w:tab w:val="num" w:pos="6480"/>
+        </w:tabs>
+        <w:ind w:left="6480" w:hanging="360"/>
+      </w:pPr>
+      <w:rPr>
+        <w:rFonts w:ascii="Wingdings" w:hAnsi="Wingdings" w:hint="default"/>
+        <w:sz w:val="20"/>
+      </w:rPr>
+    </w:lvl>
+  </w:abstractNum>
+  <w:abstractNum w:abstractNumId="7" w15:restartNumberingAfterBreak="0">
+    <w:nsid w:val="7CF218A0"/>
+    <w:multiLevelType w:val="multilevel"/>
+    <w:tmpl w:val="0405001F"/>
+    <w:lvl w:ilvl="0">
+      <w:start w:val="1"/>
+      <w:numFmt w:val="decimal"/>
+      <w:lvlText w:val="%1."/>
+      <w:lvlJc w:val="left"/>
+      <w:pPr>
+        <w:ind w:left="360" w:hanging="360"/>
+      </w:pPr>
+    </w:lvl>
+    <w:lvl w:ilvl="1">
+      <w:start w:val="1"/>
+      <w:numFmt w:val="decimal"/>
+      <w:lvlText w:val="%1.%2."/>
+      <w:lvlJc w:val="left"/>
+      <w:pPr>
+        <w:ind w:left="792" w:hanging="432"/>
+      </w:pPr>
+    </w:lvl>
+    <w:lvl w:ilvl="2">
+      <w:start w:val="1"/>
+      <w:numFmt w:val="decimal"/>
+      <w:lvlText w:val="%1.%2.%3."/>
+      <w:lvlJc w:val="left"/>
+      <w:pPr>
+        <w:ind w:left="1224" w:hanging="504"/>
+      </w:pPr>
+    </w:lvl>
+    <w:lvl w:ilvl="3">
+      <w:start w:val="1"/>
+      <w:numFmt w:val="decimal"/>
+      <w:lvlText w:val="%1.%2.%3.%4."/>
+      <w:lvlJc w:val="left"/>
+      <w:pPr>
+        <w:ind w:left="1728" w:hanging="648"/>
+      </w:pPr>
+    </w:lvl>
+    <w:lvl w:ilvl="4">
+      <w:start w:val="1"/>
+      <w:numFmt w:val="decimal"/>
+      <w:lvlText w:val="%1.%2.%3.%4.%5."/>
+      <w:lvlJc w:val="left"/>
+      <w:pPr>
+        <w:ind w:left="2232" w:hanging="792"/>
+      </w:pPr>
+    </w:lvl>
+    <w:lvl w:ilvl="5">
+      <w:start w:val="1"/>
+      <w:numFmt w:val="decimal"/>
+      <w:lvlText w:val="%1.%2.%3.%4.%5.%6."/>
+      <w:lvlJc w:val="left"/>
+      <w:pPr>
+        <w:ind w:left="2736" w:hanging="936"/>
+      </w:pPr>
+    </w:lvl>
+    <w:lvl w:ilvl="6">
+      <w:start w:val="1"/>
+      <w:numFmt w:val="decimal"/>
+      <w:lvlText w:val="%1.%2.%3.%4.%5.%6.%7."/>
+      <w:lvlJc w:val="left"/>
+      <w:pPr>
+        <w:ind w:left="3240" w:hanging="1080"/>
+      </w:pPr>
+    </w:lvl>
+    <w:lvl w:ilvl="7">
+      <w:start w:val="1"/>
+      <w:numFmt w:val="decimal"/>
+      <w:lvlText w:val="%1.%2.%3.%4.%5.%6.%7.%8."/>
+      <w:lvlJc w:val="left"/>
+      <w:pPr>
+        <w:ind w:left="3744" w:hanging="1224"/>
+      </w:pPr>
+    </w:lvl>
+    <w:lvl w:ilvl="8">
+      <w:start w:val="1"/>
+      <w:numFmt w:val="decimal"/>
+      <w:lvlText w:val="%1.%2.%3.%4.%5.%6.%7.%8.%9."/>
+      <w:lvlJc w:val="left"/>
+      <w:pPr>
+        <w:ind w:left="4320" w:hanging="1440"/>
+      </w:pPr>
+    </w:lvl>
+  </w:abstractNum>
   <w:num w:numId="1" w16cid:durableId="1681274857">
-    <w:abstractNumId w:val="2"/>
+    <w:abstractNumId w:val="4"/>
   </w:num>
   <w:num w:numId="2" w16cid:durableId="1183014231">
-    <w:abstractNumId w:val="1"/>
+    <w:abstractNumId w:val="3"/>
   </w:num>
   <w:num w:numId="3" w16cid:durableId="1240168975">
     <w:abstractNumId w:val="0"/>
   </w:num>
   <w:num w:numId="4" w16cid:durableId="78216933">
-    <w:abstractNumId w:val="3"/>
+    <w:abstractNumId w:val="5"/>
+  </w:num>
+  <w:num w:numId="5" w16cid:durableId="519584491">
+    <w:abstractNumId w:val="7"/>
+  </w:num>
+  <w:num w:numId="6" w16cid:durableId="338779831">
+    <w:abstractNumId w:val="2"/>
+  </w:num>
+  <w:num w:numId="7" w16cid:durableId="655885099">
+    <w:abstractNumId w:val="6"/>
+  </w:num>
+  <w:num w:numId="8" w16cid:durableId="1679192449">
+    <w:abstractNumId w:val="1"/>
   </w:num>
 </w:numbering>
 </file>
@@ -27425,6 +29399,36 @@
       <w:contextualSpacing/>
     </w:pPr>
   </w:style>
+  <w:style w:type="paragraph" w:styleId="Titulek">
+    <w:name w:val="caption"/>
+    <w:basedOn w:val="Normln"/>
+    <w:next w:val="Normln"/>
+    <w:uiPriority w:val="35"/>
+    <w:unhideWhenUsed/>
+    <w:qFormat/>
+    <w:rsid w:val="005D1E37"/>
+    <w:pPr>
+      <w:spacing w:after="200" w:line="240" w:lineRule="auto"/>
+    </w:pPr>
+    <w:rPr>
+      <w:i/>
+      <w:iCs/>
+      <w:color w:val="0E2841" w:themeColor="text2"/>
+      <w:sz w:val="18"/>
+      <w:szCs w:val="18"/>
+    </w:rPr>
+  </w:style>
+  <w:style w:type="paragraph" w:styleId="Seznamobrzk">
+    <w:name w:val="table of figures"/>
+    <w:basedOn w:val="Normln"/>
+    <w:next w:val="Normln"/>
+    <w:uiPriority w:val="99"/>
+    <w:unhideWhenUsed/>
+    <w:rsid w:val="00BA7BCB"/>
+    <w:pPr>
+      <w:spacing w:after="0"/>
+    </w:pPr>
+  </w:style>
 </w:styles>
 </file>
 
@@ -27741,4 +29745,16 @@
     </a:ext>
   </a:extLst>
 </a:theme>
+</file>
+
+<file path=customXml/item1.xml><?xml version="1.0" encoding="utf-8"?>
+<b:Sources xmlns:b="http://schemas.openxmlformats.org/officeDocument/2006/bibliography" xmlns="http://schemas.openxmlformats.org/officeDocument/2006/bibliography" SelectedStyle="\APASixthEditionOfficeOnline.xsl" StyleName="APA" Version="6"/>
+</file>
+
+<file path=customXml/itemProps1.xml><?xml version="1.0" encoding="utf-8"?>
+<ds:datastoreItem xmlns:ds="http://schemas.openxmlformats.org/officeDocument/2006/customXml" ds:itemID="{B740CD2C-0986-48C6-9144-5BBE57BBCB88}">
+  <ds:schemaRefs>
+    <ds:schemaRef ds:uri="http://schemas.openxmlformats.org/officeDocument/2006/bibliography"/>
+  </ds:schemaRefs>
+</ds:datastoreItem>
 </file>
</xml_diff>

<commit_message>
add diagram.svg to BP_Tehnik_HomeOS documentation
</commit_message>
<xml_diff>
--- a/dokumentace/BP_Tehnik_HomeOS.docx
+++ b/dokumentace/BP_Tehnik_HomeOS.docx
@@ -18861,11 +18861,11 @@
         <w:t xml:space="preserve">2.1.4 </w:t>
       </w:r>
       <w:r>
-        <w:t>Java – S</w:t>
-      </w:r>
-      <w:proofErr w:type="spellStart"/>
-      <w:r>
-        <w:t>pring</w:t>
+        <w:t xml:space="preserve">Java – </w:t>
+      </w:r>
+      <w:proofErr w:type="spellStart"/>
+      <w:r>
+        <w:t>Spring</w:t>
       </w:r>
       <w:proofErr w:type="spellEnd"/>
       <w:r>
@@ -19365,6 +19365,7 @@
         <w:t xml:space="preserve"> kvůli jeho dostupnosti a zkušenostem s touto značkou.</w:t>
       </w:r>
     </w:p>
+    <w:p/>
     <w:p>
       <w:pPr>
         <w:pStyle w:val="Nadpis2"/>
@@ -19590,10 +19591,13 @@
         <w:jc w:val="center"/>
       </w:pPr>
       <w:r>
+        <w:rPr>
+          <w:noProof/>
+        </w:rPr>
         <w:drawing>
-          <wp:inline distT="0" distB="0" distL="0" distR="0" wp14:anchorId="09F8FD6B" wp14:editId="3AB3B927">
-            <wp:extent cx="4943475" cy="2822658"/>
-            <wp:effectExtent l="0" t="0" r="0" b="0"/>
+          <wp:inline distT="0" distB="0" distL="0" distR="0" wp14:anchorId="09F8FD6B" wp14:editId="008F94C2">
+            <wp:extent cx="4324350" cy="2469146"/>
+            <wp:effectExtent l="0" t="0" r="0" b="7620"/>
             <wp:docPr id="1183097937" name="Obrázek 1"/>
             <wp:cNvGraphicFramePr>
               <a:graphicFrameLocks xmlns:a="http://schemas.openxmlformats.org/drawingml/2006/main" noChangeAspect="1"/>
@@ -19614,7 +19618,7 @@
                   <pic:spPr>
                     <a:xfrm>
                       <a:off x="0" y="0"/>
-                      <a:ext cx="4951770" cy="2827394"/>
+                      <a:ext cx="4337518" cy="2476665"/>
                     </a:xfrm>
                     <a:prstGeom prst="rect">
                       <a:avLst/>
@@ -19661,6 +19665,390 @@
     </w:p>
     <w:p>
       <w:pPr>
+        <w:pStyle w:val="Nadpis2"/>
+      </w:pPr>
+      <w:bookmarkStart w:id="27" w:name="_Toc229064744"/>
+      <w:r>
+        <w:lastRenderedPageBreak/>
+        <w:t>2.4 Realizace aplikace</w:t>
+      </w:r>
+    </w:p>
+    <w:p>
+      <w:r>
+        <w:t xml:space="preserve">Aplikace byla realizována v prostřední </w:t>
+      </w:r>
+      <w:proofErr w:type="spellStart"/>
+      <w:r>
+        <w:t>Pycharm</w:t>
+      </w:r>
+      <w:proofErr w:type="spellEnd"/>
+      <w:r>
+        <w:t xml:space="preserve"> Professional s využitím </w:t>
+      </w:r>
+      <w:proofErr w:type="spellStart"/>
+      <w:r>
+        <w:t>remote</w:t>
+      </w:r>
+      <w:proofErr w:type="spellEnd"/>
+      <w:r>
+        <w:t xml:space="preserve"> </w:t>
+      </w:r>
+      <w:proofErr w:type="spellStart"/>
+      <w:r>
+        <w:t>deploymentu</w:t>
+      </w:r>
+      <w:proofErr w:type="spellEnd"/>
+      <w:r>
+        <w:t xml:space="preserve">, aby se aplikace vždy spouštěla na finálním zařízení, tedy </w:t>
+      </w:r>
+      <w:proofErr w:type="spellStart"/>
+      <w:r>
+        <w:t>Raspberry</w:t>
+      </w:r>
+      <w:proofErr w:type="spellEnd"/>
+      <w:r>
+        <w:t xml:space="preserve">. Vývoj byl prováděn v iterativních způsobem, kdy v jednotlivých krocích docházelo k přidávání nových funkcionalit. Tento text popisuje strukturu aplikace, komunikaci s databází, obsluhu </w:t>
+      </w:r>
+      <w:proofErr w:type="spellStart"/>
+      <w:r>
+        <w:t>api</w:t>
+      </w:r>
+      <w:proofErr w:type="spellEnd"/>
+      <w:r>
+        <w:t xml:space="preserve"> a UI. </w:t>
+      </w:r>
+      <w:r>
+        <w:t>Tento přístup umožnil průběžné testování jednotlivých částí aplikace a jejich úpravu dle zpětné vazby a měnících se požadavků.</w:t>
+      </w:r>
+    </w:p>
+    <w:p/>
+    <w:p>
+      <w:pPr>
+        <w:pStyle w:val="Nadpis2"/>
+      </w:pPr>
+      <w:r>
+        <w:t xml:space="preserve">2.5 Funkcionalita </w:t>
+      </w:r>
+    </w:p>
+    <w:p>
+      <w:r>
+        <w:t xml:space="preserve">Aplikace tvoří komplexní webový systém pro monitoring a ovládání chytré domácnosti, provozovaný lokálně na zařízení </w:t>
+      </w:r>
+      <w:proofErr w:type="spellStart"/>
+      <w:r>
+        <w:t>Raspberry</w:t>
+      </w:r>
+      <w:proofErr w:type="spellEnd"/>
+      <w:r>
+        <w:t xml:space="preserve"> </w:t>
+      </w:r>
+      <w:proofErr w:type="spellStart"/>
+      <w:r>
+        <w:t>Pi</w:t>
+      </w:r>
+      <w:proofErr w:type="spellEnd"/>
+      <w:r>
+        <w:t xml:space="preserve"> bez závislosti na internetu nebo cloudových službách. Systém se skládá ze dvou samostatných </w:t>
+      </w:r>
+      <w:proofErr w:type="spellStart"/>
+      <w:r>
+        <w:t>Flask</w:t>
+      </w:r>
+      <w:proofErr w:type="spellEnd"/>
+      <w:r>
+        <w:t xml:space="preserve"> serverů, sdílené </w:t>
+      </w:r>
+      <w:proofErr w:type="spellStart"/>
+      <w:r>
+        <w:t>SQLite</w:t>
+      </w:r>
+      <w:proofErr w:type="spellEnd"/>
+      <w:r>
+        <w:t xml:space="preserve"> databáze a webového rozhraní přístupného z libovolného zařízení připojeného k lokální Wi-Fi síti.</w:t>
+      </w:r>
+    </w:p>
+    <w:p/>
+    <w:p>
+      <w:pPr>
+        <w:pStyle w:val="Nadpis2"/>
+      </w:pPr>
+      <w:r>
+        <w:t xml:space="preserve">2.5.1 </w:t>
+      </w:r>
+      <w:r>
+        <w:t>Sběr a ukládání dat ze senzorů</w:t>
+      </w:r>
+    </w:p>
+    <w:p>
+      <w:r>
+        <w:t>Senzorové uzly M5</w:t>
+      </w:r>
+      <w:proofErr w:type="gramStart"/>
+      <w:r>
+        <w:t>Stack</w:t>
+      </w:r>
+      <w:r>
+        <w:t>(</w:t>
+      </w:r>
+      <w:proofErr w:type="gramEnd"/>
+      <w:r>
+        <w:t xml:space="preserve">Atom a </w:t>
+      </w:r>
+      <w:proofErr w:type="spellStart"/>
+      <w:r>
+        <w:t>Core</w:t>
+      </w:r>
+      <w:proofErr w:type="spellEnd"/>
+      <w:r>
+        <w:t>)</w:t>
+      </w:r>
+      <w:r>
+        <w:t xml:space="preserve"> průběžně měří hodnoty teploty, vlhkosti a koncentrace CO2 v jednotlivých místnostech. Naměřená data jsou odesílána formou HTTP POST požadavků na </w:t>
+      </w:r>
+      <w:proofErr w:type="spellStart"/>
+      <w:r>
+        <w:t>endpoint</w:t>
+      </w:r>
+      <w:proofErr w:type="spellEnd"/>
+      <w:r>
+        <w:t xml:space="preserve"> /data serveru api.py běžícího na portu 8070. Každý požadavek obsahuje v hlavičce identifikátor místnosti, podle kterého server automaticky vytvoří odpovídající tabulku v </w:t>
+      </w:r>
+      <w:proofErr w:type="spellStart"/>
+      <w:r>
+        <w:t>SQLite</w:t>
+      </w:r>
+      <w:proofErr w:type="spellEnd"/>
+      <w:r>
+        <w:t xml:space="preserve"> databázi </w:t>
+      </w:r>
+      <w:proofErr w:type="spellStart"/>
+      <w:r>
+        <w:t>home.db</w:t>
+      </w:r>
+      <w:proofErr w:type="spellEnd"/>
+      <w:r>
+        <w:t>, pokud ještě neexistuje, a nový záznam do ní zapíše včetně časové značky. Díky tomuto přístupu je systém snadno rozšiřitelný o další senzorové uzly bez nutnosti jakékoli úpravy kódu.</w:t>
+      </w:r>
+    </w:p>
+    <w:p/>
+    <w:p>
+      <w:pPr>
+        <w:pStyle w:val="Nadpis2"/>
+      </w:pPr>
+      <w:r>
+        <w:t xml:space="preserve">2.5.2 </w:t>
+      </w:r>
+      <w:r>
+        <w:t>Webový dashboard a widgety</w:t>
+      </w:r>
+    </w:p>
+    <w:p>
+      <w:r>
+        <w:t xml:space="preserve">Hlavní uživatelské rozhraní je přístupné přes webový prohlížeč na portu 8000 a tvoří ho dynamický dashboard s konfigurovatelnou sadou widgetů. Uživatel může přidávat nové widgety prostřednictvím modálního dialogu, kde zvolí název, zdrojovou místnost (tabulku v databázi), typ senzoru a způsob výpočtu zobrazované hodnoty – aktuální hodnotu, průměr, minimum nebo maximum. Každý widget zobrazuje živou hodnotu automaticky obnovovanou v nastavitelném intervalu a časový údaj o poslední aktualizaci. Data jsou načítána asynchronně přes </w:t>
+      </w:r>
+      <w:proofErr w:type="spellStart"/>
+      <w:r>
+        <w:t>endpoint</w:t>
+      </w:r>
+      <w:proofErr w:type="spellEnd"/>
+      <w:r>
+        <w:t xml:space="preserve"> /</w:t>
+      </w:r>
+      <w:proofErr w:type="spellStart"/>
+      <w:r>
+        <w:t>api</w:t>
+      </w:r>
+      <w:proofErr w:type="spellEnd"/>
+      <w:r>
+        <w:t>/</w:t>
+      </w:r>
+      <w:proofErr w:type="spellStart"/>
+      <w:r>
+        <w:t>widget_data</w:t>
+      </w:r>
+      <w:proofErr w:type="spellEnd"/>
+      <w:r>
+        <w:t xml:space="preserve"> bez nutnosti znovunačtení stránky. Widgety lze rovněž odstraňovat přímo z dashboardu.</w:t>
+      </w:r>
+    </w:p>
+    <w:p/>
+    <w:p>
+      <w:pPr>
+        <w:pStyle w:val="Nadpis2"/>
+      </w:pPr>
+      <w:r>
+        <w:t xml:space="preserve">2.5.3 </w:t>
+      </w:r>
+      <w:r>
+        <w:t>Historická data a grafické zobrazení</w:t>
+      </w:r>
+    </w:p>
+    <w:p>
+      <w:r>
+        <w:t xml:space="preserve">Kliknutím na libovolný senzorový widget se zobrazí překryvný panel s interaktivním grafem historie naměřených hodnot vykresleným pomocí knihovny Chart.js. Uživatel může zobrazit data za předdefinovaná časová období – týden, měsíc nebo rok – nebo zadat vlastní rozsah pomocí přesného výběru data a času prostřednictvím knihovny </w:t>
+      </w:r>
+      <w:proofErr w:type="spellStart"/>
+      <w:r>
+        <w:t>Flatpickr</w:t>
+      </w:r>
+      <w:proofErr w:type="spellEnd"/>
+      <w:r>
+        <w:t xml:space="preserve">. Historická data jsou načítána z </w:t>
+      </w:r>
+      <w:proofErr w:type="spellStart"/>
+      <w:r>
+        <w:t>endpointu</w:t>
+      </w:r>
+      <w:proofErr w:type="spellEnd"/>
+      <w:r>
+        <w:t xml:space="preserve"> /</w:t>
+      </w:r>
+      <w:proofErr w:type="spellStart"/>
+      <w:r>
+        <w:t>api</w:t>
+      </w:r>
+      <w:proofErr w:type="spellEnd"/>
+      <w:r>
+        <w:t>/</w:t>
+      </w:r>
+      <w:proofErr w:type="spellStart"/>
+      <w:r>
+        <w:t>widget_history</w:t>
+      </w:r>
+      <w:proofErr w:type="spellEnd"/>
+      <w:r>
+        <w:t xml:space="preserve"> a graf se automaticky přizpůsobí množství dat – při velkém počtu záznamů jsou skryty datové body pro lepší přehlednost.</w:t>
+      </w:r>
+    </w:p>
+    <w:p/>
+    <w:p>
+      <w:pPr>
+        <w:pStyle w:val="Nadpis2"/>
+      </w:pPr>
+      <w:r>
+        <w:lastRenderedPageBreak/>
+        <w:t xml:space="preserve">2.5.4 </w:t>
+      </w:r>
+      <w:r>
+        <w:t>Ovládání relé a fyzických spotřebičů</w:t>
+      </w:r>
+    </w:p>
+    <w:p>
+      <w:r>
+        <w:t xml:space="preserve">Systém umožňuje nejen pasivní monitoring, ale také aktivní ovládání připojených spotřebičů prostřednictvím relé modulů. Pro každé ze šesti dostupných relé lze přidat dedikovaný widget přímo na dashboard, který obsahuje tlačítka pro zapnutí a vypnutí. Po stisknutí tlačítka je odeslán HTTP POST požadavek na </w:t>
+      </w:r>
+      <w:proofErr w:type="spellStart"/>
+      <w:r>
+        <w:t>endpoint</w:t>
+      </w:r>
+      <w:proofErr w:type="spellEnd"/>
+      <w:r>
+        <w:t xml:space="preserve"> /</w:t>
+      </w:r>
+      <w:proofErr w:type="spellStart"/>
+      <w:r>
+        <w:t>relay</w:t>
+      </w:r>
+      <w:proofErr w:type="spellEnd"/>
+      <w:r>
+        <w:t>/{id}/{akce} serveru api.py, který přeloží příkaz do MQTT zprávy a odešle ji přes lokálního MQTT brokera na příslušné relé. Stav odeslání je uživateli okamžitě zobrazen přímo ve widgetu.</w:t>
+      </w:r>
+    </w:p>
+    <w:p/>
+    <w:p>
+      <w:pPr>
+        <w:pStyle w:val="Nadpis2"/>
+      </w:pPr>
+      <w:r>
+        <w:t xml:space="preserve">2.5.5 </w:t>
+      </w:r>
+      <w:r>
+        <w:t>Nastavení systému</w:t>
+      </w:r>
+    </w:p>
+    <w:p>
+      <w:r>
+        <w:t xml:space="preserve">Aplikace disponuje stránkou nastavení, kde může uživatel konfigurovat základní parametry systému – jméno správce, notifikační e-mail, interval automatické aktualizace dat, jednotky zobrazování teploty (Celsius nebo Fahrenheit) a aktivaci nočního bezpečnostního režimu. Veškerá nastavení jsou ukládána do souboru </w:t>
+      </w:r>
+      <w:proofErr w:type="spellStart"/>
+      <w:proofErr w:type="gramStart"/>
+      <w:r>
+        <w:t>settings.json</w:t>
+      </w:r>
+      <w:proofErr w:type="spellEnd"/>
+      <w:proofErr w:type="gramEnd"/>
+      <w:r>
+        <w:t xml:space="preserve"> přes </w:t>
+      </w:r>
+      <w:proofErr w:type="spellStart"/>
+      <w:r>
+        <w:t>endpoint</w:t>
+      </w:r>
+      <w:proofErr w:type="spellEnd"/>
+      <w:r>
+        <w:t xml:space="preserve"> /</w:t>
+      </w:r>
+      <w:proofErr w:type="spellStart"/>
+      <w:r>
+        <w:t>api</w:t>
+      </w:r>
+      <w:proofErr w:type="spellEnd"/>
+      <w:r>
+        <w:t>/</w:t>
+      </w:r>
+      <w:proofErr w:type="spellStart"/>
+      <w:r>
+        <w:t>save_settings</w:t>
+      </w:r>
+      <w:proofErr w:type="spellEnd"/>
+      <w:r>
+        <w:t xml:space="preserve"> a při každém spuštění aplikace automaticky načítána, přičemž pro případ chybějícího nebo poškozeného souboru jsou definovány výchozí hodnoty.</w:t>
+      </w:r>
+    </w:p>
+    <w:p/>
+    <w:p>
+      <w:pPr>
+        <w:pStyle w:val="Nadpis2"/>
+      </w:pPr>
+      <w:r>
+        <w:t xml:space="preserve">2.5.6 </w:t>
+      </w:r>
+      <w:r>
+        <w:t>Síťová infrastruktura</w:t>
+      </w:r>
+    </w:p>
+    <w:p>
+      <w:r>
+        <w:t xml:space="preserve">Při spuštění aplikace </w:t>
+      </w:r>
+      <w:proofErr w:type="spellStart"/>
+      <w:r>
+        <w:t>Raspberry</w:t>
+      </w:r>
+      <w:proofErr w:type="spellEnd"/>
+      <w:r>
+        <w:t xml:space="preserve"> </w:t>
+      </w:r>
+      <w:proofErr w:type="spellStart"/>
+      <w:r>
+        <w:t>Pi</w:t>
+      </w:r>
+      <w:proofErr w:type="spellEnd"/>
+      <w:r>
+        <w:t xml:space="preserve"> automaticky vytvoří Wi-Fi hotspot pomocí nástroje </w:t>
+      </w:r>
+      <w:proofErr w:type="spellStart"/>
+      <w:r>
+        <w:t>nmcli</w:t>
+      </w:r>
+      <w:proofErr w:type="spellEnd"/>
+      <w:r>
+        <w:t xml:space="preserve"> prostřednictvím modulu hotspot.py. Uživatelé i senzorové uzly M5Stack se připojují k této lokální síti, čímž celý systém funguje zcela samostatně a nevyžaduje existující domácí síťovou infrastrukturu ani přístup k internetu. Toto řešení zároveň zvyšuje bezpečnost systému, jelikož veškerá komunikace zůstává izolována v lokální síti.</w:t>
+      </w:r>
+    </w:p>
+    <w:p/>
+    <w:p>
+      <w:pPr>
         <w:pStyle w:val="Nadpis3"/>
         <w:spacing w:after="0"/>
         <w:ind w:left="-5"/>
@@ -19668,9 +20056,7 @@
           <w:lang w:val="en-US"/>
         </w:rPr>
       </w:pPr>
-      <w:bookmarkStart w:id="27" w:name="_Toc229064744"/>
-      <w:r>
-        <w:lastRenderedPageBreak/>
+      <w:r>
         <w:t>1.1</w:t>
       </w:r>
       <w:r>
@@ -23727,6 +24113,7 @@
         <w:rPr>
           <w:noProof/>
         </w:rPr>
+        <w:lastRenderedPageBreak/>
         <w:drawing>
           <wp:inline distT="0" distB="0" distL="0" distR="0" wp14:anchorId="0CA1D73B" wp14:editId="3ED71B07">
             <wp:extent cx="2895600" cy="1571625"/>
@@ -24733,7 +25120,6 @@
       </w:pPr>
       <w:bookmarkStart w:id="30" w:name="_Toc229064747"/>
       <w:r>
-        <w:lastRenderedPageBreak/>
         <w:t>1.6</w:t>
       </w:r>
       <w:r>

</xml_diff>